<commit_message>
rename LPW to TA
rename LPW to TA
</commit_message>
<xml_diff>
--- a/vkr_working.docx
+++ b/vkr_working.docx
@@ -77,7 +77,17 @@
           <w:sz w:val="28"/>
           <w:szCs w:val="28"/>
         </w:rPr>
-        <w:t>ОБОЗНАЧЕНИЯ И СОКРАЩЕНИЯ</w:t>
+        <w:t>ОБОЗНАЧЕ</w:t>
+      </w:r>
+      <w:bookmarkStart w:id="61" w:name="_GoBack"/>
+      <w:bookmarkEnd w:id="61"/>
+      <w:r>
+        <w:rPr>
+          <w:rFonts w:ascii="Times New Roman" w:hAnsi="Times New Roman" w:cs="Times New Roman"/>
+          <w:sz w:val="28"/>
+          <w:szCs w:val="28"/>
+        </w:rPr>
+        <w:t>НИЯ И СОКРАЩЕНИЯ</w:t>
       </w:r>
       <w:r>
         <w:rPr>
@@ -621,7 +631,7 @@
           <w:sz w:val="28"/>
           <w:szCs w:val="28"/>
         </w:rPr>
-        <w:t>12</w:t>
+        <w:t>11</w:t>
       </w:r>
       <w:r>
         <w:rPr>
@@ -705,7 +715,7 @@
           <w:sz w:val="28"/>
           <w:szCs w:val="28"/>
         </w:rPr>
-        <w:t>13</w:t>
+        <w:t>12</w:t>
       </w:r>
       <w:r>
         <w:rPr>
@@ -789,7 +799,7 @@
           <w:sz w:val="28"/>
           <w:szCs w:val="28"/>
         </w:rPr>
-        <w:t>14</w:t>
+        <w:t>13</w:t>
       </w:r>
       <w:r>
         <w:rPr>
@@ -873,7 +883,7 @@
           <w:sz w:val="28"/>
           <w:szCs w:val="28"/>
         </w:rPr>
-        <w:t>14</w:t>
+        <w:t>13</w:t>
       </w:r>
       <w:r>
         <w:rPr>
@@ -957,7 +967,7 @@
           <w:sz w:val="28"/>
           <w:szCs w:val="28"/>
         </w:rPr>
-        <w:t>16</w:t>
+        <w:t>15</w:t>
       </w:r>
       <w:r>
         <w:rPr>
@@ -1041,7 +1051,7 @@
           <w:sz w:val="28"/>
           <w:szCs w:val="28"/>
         </w:rPr>
-        <w:t>16</w:t>
+        <w:t>15</w:t>
       </w:r>
       <w:r>
         <w:rPr>
@@ -1125,7 +1135,7 @@
           <w:sz w:val="28"/>
           <w:szCs w:val="28"/>
         </w:rPr>
-        <w:t>17</w:t>
+        <w:t>16</w:t>
       </w:r>
       <w:r>
         <w:rPr>
@@ -1209,7 +1219,7 @@
           <w:sz w:val="28"/>
           <w:szCs w:val="28"/>
         </w:rPr>
-        <w:t>18</w:t>
+        <w:t>17</w:t>
       </w:r>
       <w:r>
         <w:rPr>
@@ -1293,7 +1303,7 @@
           <w:sz w:val="28"/>
           <w:szCs w:val="28"/>
         </w:rPr>
-        <w:t>18</w:t>
+        <w:t>17</w:t>
       </w:r>
       <w:r>
         <w:rPr>
@@ -1377,7 +1387,7 @@
           <w:sz w:val="28"/>
           <w:szCs w:val="28"/>
         </w:rPr>
-        <w:t>19</w:t>
+        <w:t>17</w:t>
       </w:r>
       <w:r>
         <w:rPr>
@@ -1461,7 +1471,7 @@
           <w:sz w:val="28"/>
           <w:szCs w:val="28"/>
         </w:rPr>
-        <w:t>19</w:t>
+        <w:t>18</w:t>
       </w:r>
       <w:r>
         <w:rPr>
@@ -1545,7 +1555,7 @@
           <w:sz w:val="28"/>
           <w:szCs w:val="28"/>
         </w:rPr>
-        <w:t>20</w:t>
+        <w:t>19</w:t>
       </w:r>
       <w:r>
         <w:rPr>
@@ -1629,7 +1639,7 @@
           <w:sz w:val="28"/>
           <w:szCs w:val="28"/>
         </w:rPr>
-        <w:t>20</w:t>
+        <w:t>19</w:t>
       </w:r>
       <w:r>
         <w:rPr>
@@ -1713,7 +1723,7 @@
           <w:sz w:val="28"/>
           <w:szCs w:val="28"/>
         </w:rPr>
-        <w:t>21</w:t>
+        <w:t>19</w:t>
       </w:r>
       <w:r>
         <w:rPr>
@@ -1797,7 +1807,7 @@
           <w:sz w:val="28"/>
           <w:szCs w:val="28"/>
         </w:rPr>
-        <w:t>21</w:t>
+        <w:t>20</w:t>
       </w:r>
       <w:r>
         <w:rPr>
@@ -1881,7 +1891,7 @@
           <w:sz w:val="28"/>
           <w:szCs w:val="28"/>
         </w:rPr>
-        <w:t>22</w:t>
+        <w:t>20</w:t>
       </w:r>
       <w:r>
         <w:rPr>
@@ -1965,7 +1975,7 @@
           <w:sz w:val="28"/>
           <w:szCs w:val="28"/>
         </w:rPr>
-        <w:t>25</w:t>
+        <w:t>23</w:t>
       </w:r>
       <w:r>
         <w:rPr>
@@ -2049,7 +2059,7 @@
           <w:sz w:val="28"/>
           <w:szCs w:val="28"/>
         </w:rPr>
-        <w:t>27</w:t>
+        <w:t>25</w:t>
       </w:r>
       <w:r>
         <w:rPr>
@@ -2133,7 +2143,7 @@
           <w:sz w:val="28"/>
           <w:szCs w:val="28"/>
         </w:rPr>
-        <w:t>27</w:t>
+        <w:t>25</w:t>
       </w:r>
       <w:r>
         <w:rPr>
@@ -2217,7 +2227,7 @@
           <w:sz w:val="28"/>
           <w:szCs w:val="28"/>
         </w:rPr>
-        <w:t>29</w:t>
+        <w:t>27</w:t>
       </w:r>
       <w:r>
         <w:rPr>
@@ -2301,7 +2311,7 @@
           <w:sz w:val="28"/>
           <w:szCs w:val="28"/>
         </w:rPr>
-        <w:t>33</w:t>
+        <w:t>31</w:t>
       </w:r>
       <w:r>
         <w:rPr>
@@ -2385,7 +2395,7 @@
           <w:sz w:val="28"/>
           <w:szCs w:val="28"/>
         </w:rPr>
-        <w:t>34</w:t>
+        <w:t>33</w:t>
       </w:r>
       <w:r>
         <w:rPr>
@@ -2469,7 +2479,7 @@
           <w:sz w:val="28"/>
           <w:szCs w:val="28"/>
         </w:rPr>
-        <w:t>38</w:t>
+        <w:t>37</w:t>
       </w:r>
       <w:r>
         <w:rPr>
@@ -2553,7 +2563,7 @@
           <w:sz w:val="28"/>
           <w:szCs w:val="28"/>
         </w:rPr>
-        <w:t>41</w:t>
+        <w:t>40</w:t>
       </w:r>
       <w:r>
         <w:rPr>
@@ -2637,7 +2647,7 @@
           <w:sz w:val="28"/>
           <w:szCs w:val="28"/>
         </w:rPr>
-        <w:t>43</w:t>
+        <w:t>42</w:t>
       </w:r>
       <w:r>
         <w:rPr>
@@ -2721,7 +2731,7 @@
           <w:sz w:val="28"/>
           <w:szCs w:val="28"/>
         </w:rPr>
-        <w:t>43</w:t>
+        <w:t>42</w:t>
       </w:r>
       <w:r>
         <w:rPr>
@@ -2805,7 +2815,7 @@
           <w:sz w:val="28"/>
           <w:szCs w:val="28"/>
         </w:rPr>
-        <w:t>43</w:t>
+        <w:t>44</w:t>
       </w:r>
       <w:r>
         <w:rPr>
@@ -2889,7 +2899,7 @@
           <w:sz w:val="28"/>
           <w:szCs w:val="28"/>
         </w:rPr>
-        <w:t>45</w:t>
+        <w:t>46</w:t>
       </w:r>
       <w:r>
         <w:rPr>
@@ -2973,7 +2983,7 @@
           <w:sz w:val="28"/>
           <w:szCs w:val="28"/>
         </w:rPr>
-        <w:t>46</w:t>
+        <w:t>47</w:t>
       </w:r>
       <w:r>
         <w:rPr>
@@ -3057,7 +3067,7 @@
           <w:sz w:val="28"/>
           <w:szCs w:val="28"/>
         </w:rPr>
-        <w:t>47</w:t>
+        <w:t>48</w:t>
       </w:r>
       <w:r>
         <w:rPr>
@@ -3141,7 +3151,7 @@
           <w:sz w:val="28"/>
           <w:szCs w:val="28"/>
         </w:rPr>
-        <w:t>47</w:t>
+        <w:t>48</w:t>
       </w:r>
       <w:r>
         <w:rPr>
@@ -3225,7 +3235,7 @@
           <w:sz w:val="28"/>
           <w:szCs w:val="28"/>
         </w:rPr>
-        <w:t>48</w:t>
+        <w:t>49</w:t>
       </w:r>
       <w:r>
         <w:rPr>
@@ -3309,7 +3319,7 @@
           <w:sz w:val="28"/>
           <w:szCs w:val="28"/>
         </w:rPr>
-        <w:t>49</w:t>
+        <w:t>50</w:t>
       </w:r>
       <w:r>
         <w:rPr>
@@ -3393,7 +3403,7 @@
           <w:sz w:val="28"/>
           <w:szCs w:val="28"/>
         </w:rPr>
-        <w:t>50</w:t>
+        <w:t>51</w:t>
       </w:r>
       <w:r>
         <w:rPr>
@@ -3477,7 +3487,7 @@
           <w:sz w:val="28"/>
           <w:szCs w:val="28"/>
         </w:rPr>
-        <w:t>50</w:t>
+        <w:t>51</w:t>
       </w:r>
       <w:r>
         <w:rPr>
@@ -3561,7 +3571,7 @@
           <w:sz w:val="28"/>
           <w:szCs w:val="28"/>
         </w:rPr>
-        <w:t>51</w:t>
+        <w:t>52</w:t>
       </w:r>
       <w:r>
         <w:rPr>
@@ -3645,7 +3655,7 @@
           <w:sz w:val="28"/>
           <w:szCs w:val="28"/>
         </w:rPr>
-        <w:t>51</w:t>
+        <w:t>52</w:t>
       </w:r>
       <w:r>
         <w:rPr>
@@ -3729,7 +3739,7 @@
           <w:sz w:val="28"/>
           <w:szCs w:val="28"/>
         </w:rPr>
-        <w:t>52</w:t>
+        <w:t>53</w:t>
       </w:r>
       <w:r>
         <w:rPr>
@@ -3813,7 +3823,7 @@
           <w:sz w:val="28"/>
           <w:szCs w:val="28"/>
         </w:rPr>
-        <w:t>53</w:t>
+        <w:t>54</w:t>
       </w:r>
       <w:r>
         <w:rPr>
@@ -3897,7 +3907,7 @@
           <w:sz w:val="28"/>
           <w:szCs w:val="28"/>
         </w:rPr>
-        <w:t>53</w:t>
+        <w:t>55</w:t>
       </w:r>
       <w:r>
         <w:rPr>
@@ -3981,7 +3991,7 @@
           <w:sz w:val="28"/>
           <w:szCs w:val="28"/>
         </w:rPr>
-        <w:t>54</w:t>
+        <w:t>55</w:t>
       </w:r>
       <w:r>
         <w:rPr>
@@ -4065,7 +4075,7 @@
           <w:sz w:val="28"/>
           <w:szCs w:val="28"/>
         </w:rPr>
-        <w:t>54</w:t>
+        <w:t>55</w:t>
       </w:r>
       <w:r>
         <w:rPr>
@@ -4149,7 +4159,7 @@
           <w:sz w:val="28"/>
           <w:szCs w:val="28"/>
         </w:rPr>
-        <w:t>55</w:t>
+        <w:t>56</w:t>
       </w:r>
       <w:r>
         <w:rPr>
@@ -4233,7 +4243,7 @@
           <w:sz w:val="28"/>
           <w:szCs w:val="28"/>
         </w:rPr>
-        <w:t>56</w:t>
+        <w:t>57</w:t>
       </w:r>
       <w:r>
         <w:rPr>
@@ -4317,7 +4327,7 @@
           <w:sz w:val="28"/>
           <w:szCs w:val="28"/>
         </w:rPr>
-        <w:t>57</w:t>
+        <w:t>59</w:t>
       </w:r>
       <w:r>
         <w:rPr>
@@ -4401,7 +4411,7 @@
           <w:sz w:val="28"/>
           <w:szCs w:val="28"/>
         </w:rPr>
-        <w:t>59</w:t>
+        <w:t>61</w:t>
       </w:r>
       <w:r>
         <w:rPr>
@@ -4485,7 +4495,7 @@
           <w:sz w:val="28"/>
           <w:szCs w:val="28"/>
         </w:rPr>
-        <w:t>59</w:t>
+        <w:t>61</w:t>
       </w:r>
       <w:r>
         <w:rPr>
@@ -4569,7 +4579,7 @@
           <w:sz w:val="28"/>
           <w:szCs w:val="28"/>
         </w:rPr>
-        <w:t>62</w:t>
+        <w:t>63</w:t>
       </w:r>
       <w:r>
         <w:rPr>
@@ -4653,7 +4663,7 @@
           <w:sz w:val="28"/>
           <w:szCs w:val="28"/>
         </w:rPr>
-        <w:t>64</w:t>
+        <w:t>65</w:t>
       </w:r>
       <w:r>
         <w:rPr>
@@ -4737,7 +4747,7 @@
           <w:sz w:val="28"/>
           <w:szCs w:val="28"/>
         </w:rPr>
-        <w:t>67</w:t>
+        <w:t>69</w:t>
       </w:r>
       <w:r>
         <w:rPr>
@@ -4821,7 +4831,7 @@
           <w:sz w:val="28"/>
           <w:szCs w:val="28"/>
         </w:rPr>
-        <w:t>69</w:t>
+        <w:t>71</w:t>
       </w:r>
       <w:r>
         <w:rPr>
@@ -4905,7 +4915,7 @@
           <w:sz w:val="28"/>
           <w:szCs w:val="28"/>
         </w:rPr>
-        <w:t>71</w:t>
+        <w:t>72</w:t>
       </w:r>
       <w:r>
         <w:rPr>
@@ -4989,7 +4999,7 @@
           <w:sz w:val="28"/>
           <w:szCs w:val="28"/>
         </w:rPr>
-        <w:t>75</w:t>
+        <w:t>77</w:t>
       </w:r>
       <w:r>
         <w:rPr>
@@ -5073,7 +5083,7 @@
           <w:sz w:val="28"/>
           <w:szCs w:val="28"/>
         </w:rPr>
-        <w:t>77</w:t>
+        <w:t>80</w:t>
       </w:r>
       <w:r>
         <w:rPr>
@@ -5157,7 +5167,7 @@
           <w:sz w:val="28"/>
           <w:szCs w:val="28"/>
         </w:rPr>
-        <w:t>81</w:t>
+        <w:t>84</w:t>
       </w:r>
       <w:r>
         <w:rPr>
@@ -5429,7 +5439,7 @@
           <w:sz w:val="28"/>
           <w:szCs w:val="28"/>
         </w:rPr>
-        <w:t>LPW — Local Packet Whisperer</w:t>
+        <w:t>TA — Traffic analyzer</w:t>
       </w:r>
     </w:p>
     <w:p>
@@ -5595,7 +5605,7 @@
     </w:p>
     <w:p>
       <w:r>
-        <w:t>1) провести аналитический обзор существующих подходов к анализу сетевого трафика, семейств открытых языковых моделей, локальных движков исполнения и метрик качества классификации; 2) разработать формальную двухуровневую схему NetworkEvent для представления событий пакетного и потокового уровней в JSON Schema 2020-12 [4]; 3) предложить метод трансляции pcap в схему и далее в промпт, предусматривающий фиксацию таксономии меток, санитизацию прикладной сводки и валидацию ответа локальной модели; 4) реализовать программное решение Local Packet Whisperer на платформе Python с использованием Streamlit [5], Ollama, PyShark [6], Scapy [7] и scikit-learn [8]; 5) провести экспериментальную проверку метода на наборе UNSW-NB15 с сопоставлением с базовыми классификаторами RandomForest, LogisticRegression и MLP по согласованной системе метрик; 6) построить модель угроз и сформировать политики безопасности разработанного решения в соответствии с методикой ФСТЭК России 2021 года и с проекцией на реестр OWASP Top 10 for LLM Applications.</w:t>
+        <w:t>1) провести аналитический обзор существующих подходов к анализу сетевого трафика, семейств открытых языковых моделей, локальных движков исполнения и метрик качества классификации; 2) разработать формальную двухуровневую схему NetworkEvent для представления событий пакетного и потокового уровней в JSON Schema 2020-12 [4]; 3) предложить метод трансляции pcap в схему и далее в промпт, предусматривающий фиксацию таксономии меток, санитизацию прикладной сводки и валидацию ответа локальной модели; 4) реализовать программное решение Traffic analyzer на платформе Python с использованием Streamlit [5], Ollama, PyShark [6], Scapy [7] и scikit-learn [8]; 5) провести экспериментальную проверку метода на наборе UNSW-NB15 с сопоставлением с базовыми классификаторами RandomForest, LogisticRegression и MLP по согласованной системе метрик; 6) построить модель угроз и сформировать политики безопасности разработанного решения в соответствии с методикой ФСТЭК России 2021 года и с проекцией на реестр OWASP Top 10 for LLM Applications.</w:t>
       </w:r>
     </w:p>
     <w:p>
@@ -5610,7 +5620,7 @@
     </w:p>
     <w:p>
       <w:r>
-        <w:t>Практическая значимость работы заключается в разработке программного решения Local Packet Whisperer, пригодного для использования в локальной инфраструктуре оператора без передачи трафика во внешние сервисы, и в воспроизводимом сценарии эксперимента, позволяющем сопоставлять локальную языковую модель с базовыми классификаторами по единой таксономии угроз. Полученные количественные оценки на наборе UNSW-NB15 (F1_macro 0,930 для RandomForest, 0,421 для гибридного метода на phi3:mini при размере выборки 1000 записей) и набор из 36 модульных тестов, фиксирующих контракт схемы и шлюза, образуют основу для дальнейшего развития метода и для применения в учебных и испытательных стендах подразделений информационной безопасности. Сформированная модель угроз и политики безопасности увязаны с банком данных угроз ФСТЭК и с методикой оценки угроз ФСТЭК 2021 года, что упрощает интеграцию полученных результатов в действующие процессы оценки соответствия.</w:t>
+        <w:t>Практическая значимость работы заключается в разработке программного решения Traffic analyzer, пригодного для использования в локальной инфраструктуре оператора без передачи трафика во внешние сервисы, и в воспроизводимом сценарии эксперимента, позволяющем сопоставлять локальную языковую модель с базовыми классификаторами по единой таксономии угроз. Полученные количественные оценки на наборе UNSW-NB15 (F1_macro 0,930 для RandomForest, 0,421 для гибридного метода на phi3:mini при размере выборки 1000 записей) и набор из 36 модульных тестов, фиксирующих контракт схемы и шлюза, образуют основу для дальнейшего развития метода и для применения в учебных и испытательных стендах подразделений информационной безопасности. Сформированная модель угроз и политики безопасности увязаны с банком данных угроз ФСТЭК и с методикой оценки угроз ФСТЭК 2021 года, что упрощает интеграцию полученных результатов в действующие процессы оценки соответствия.</w:t>
       </w:r>
     </w:p>
     <w:p>
@@ -5620,7 +5630,7 @@
     </w:p>
     <w:p>
       <w:r>
-        <w:t>Работа состоит из введения, четырёх глав, заключения, списка использованных источников и приложений. В первой главе проведён аналитический обзор задачи анализа трафика, существующих подходов, метрик качества, локальных языковых моделей и угроз их применения. Во второй главе представлены формальное описание схемы NetworkEvent, метод трансляции pcap в схему и далее в промпт и архитектурные решения шлюза локальной модели. В третьей главе изложены реализация программного решения Local Packet Whisperer и результаты экспериментальной проверки на наборе UNSW-NB15. В четвёртой главе построены модель угроз и политики безопасности. В заключении сформулированы выводы и направления дальнейших исследований.</w:t>
+        <w:t>Работа состоит из введения, четырёх глав, заключения, списка использованных источников и приложений. В первой главе проведён аналитический обзор задачи анализа трафика, существующих подходов, метрик качества, локальных языковых моделей и угроз их применения. Во второй главе представлены формальное описание схемы NetworkEvent, метод трансляции pcap в схему и далее в промпт и архитектурные решения шлюза локальной модели. В третьей главе изложены реализация программного решения Traffic analyzer и результаты экспериментальной проверки на наборе UNSW-NB15. В четвёртой главе построены модель угроз и политики безопасности. В заключении сформулированы выводы и направления дальнейших исследований.</w:t>
       </w:r>
     </w:p>
     <w:p/>
@@ -5646,17 +5656,17 @@
     </w:p>
     <w:p>
       <w:r>
-        <w:t>Анализ сетевого трафика рассматривается в работе как процесс получения управленческих решений по результатам обработки наблюдаемых сетевых событий. Целевыми задачами анализа являются: классификация событий по заранее определённой таксономии (фоновое, разведывательное, эксплуатационное, отказ в обслуживании и иные категории); обнаружение аномалий, не объяснимых нормальной моделью поведения; детектирование известных атак по сигнатурам; выявление цепочек связанных событий, образующих сценарии компрометации.</w:t>
-      </w:r>
-    </w:p>
-    <w:p>
-      <w:r>
-        <w:t>Основными источниками данных при анализе трафика являются файлы захвата pcap (Packet Capture) и pcapng, формируемые драйверами libpcap, npcap и средствами Wireshark; потоковые отчёты NetFlow и IPFIX, агрегирующие сетевые соединения по 5-tuple; журналы сенсора Zeek [12], дающие протокольно-ориентированное представление событий; журналы прокси-серверов и систем фильтрации, фиксирующие прикладной слой; журналы межсетевых экранов и средств класса EDR, отражающие реакцию защитных механизмов на наблюдаемые события.</w:t>
-      </w:r>
-    </w:p>
-    <w:p>
-      <w:r>
-        <w:t>Существенным ограничением табличных наборов данных является отсутствие исходных pcap-файлов, либо неполное их представление, что вынуждает исследователей восстанавливать признаки потокового уровня по агрегатам, сформированным авторами набора. В работе в качестве основного экспериментального набора применяется UNSW-NB15 в форме CSV-файлов, при этом поля src_ip, dst_ip, src_port, dst_port отсутствуют в исходных данных и заполняются плейсхолдерами при препроцессинге, что является известным ограничением метода трансляции для табличных наборов.</w:t>
+        <w:t>Анализ сетевого трафика в работе понимается как процесс выработки управленческих решений по результатам обработки наблюдаемых сетевых событий. К целевым задачам анализа относятся: классификация событий по заранее заданной таксономии (фон, разведка, эксплуатация, отказ в обслуживании и пр.); обнаружение аномалий, не объяснимых нормальной моделью поведения; детектирование известных атак по сигнатурам; выявление цепочек связанных событий, образующих сценарии компрометации; восстановление контекста инцидента для последующего расследования.</w:t>
+      </w:r>
+    </w:p>
+    <w:p>
+      <w:r>
+        <w:t>Основные источники данных при анализе трафика — файлы захвата pcap (Packet Capture) и pcapng, формируемые драйверами libpcap, npcap и средствами Wireshark; потоковые отчёты NetFlow и IPFIX, агрегирующие сетевые соединения по 5-tuple; журналы сенсора Zeek [12] с протокольно-ориентированным представлением событий; журналы прокси-серверов и систем фильтрации, фиксирующие прикладной слой; журналы межсетевых экранов и средств класса EDR, отражающие реакцию защитных механизмов на наблюдаемую активность. Для воспроизводимых экспериментов в задачах классификации часто берут предобработанные табличные наборы — KDD'99, NSL-KDD, UNSW-NB15 [2], CICIDS2017 [3], — где из исходных pcap уже извлечены признаки потокового уровня.</w:t>
+      </w:r>
+    </w:p>
+    <w:p>
+      <w:r>
+        <w:t>Существенный недостаток табличных наборов — отсутствие исходных pcap-файлов либо их неполное представление, из-за чего исследователям приходится восстанавливать признаки потокового уровня по агрегатам, сформированным авторами набора. В работе как основной экспериментальный набор используется UNSW-NB15 в форме CSV-файлов; поля src_ip, dst_ip, src_port, dst_port в исходных данных отсутствуют и заполняются плейсхолдерами при препроцессинге, что является известным ограничением открытых табличных IDS-датасетов.</w:t>
       </w:r>
     </w:p>
     <w:p>
@@ -5686,17 +5696,17 @@
     </w:p>
     <w:p>
       <w:r>
-        <w:t>В сигнатурном подходе наблюдаемые пакеты и потоки сравниваются с заранее заданными правилами, описывающими признаки известных атак. Открытые реализации сигнатурного подхода — Snort, Suricata [21] и Zeek [12]. Правила Snort и Suricata записываются как условие над заголовками сетевых протоколов и регулярными выражениями над полезной нагрузкой; Zeek дополняет язык правил скриптовой средой и описывает сценарии на уровне сессий.</w:t>
-      </w:r>
-    </w:p>
-    <w:p>
-      <w:r>
-        <w:t>Сильные стороны сигнатурного подхода — низкая доля ложных срабатываний на классе атак, ранее описанных правилом, и прозрачность диагностики: для каждого срабатывания указываются номер правила и место в трафике, где оно совпало. Размещение сенсора в линии не приводит к существенным потерям пропускной способности. На этих свойствах построена работа большинства промышленных систем обнаружения вторжений.</w:t>
-      </w:r>
-    </w:p>
-    <w:p>
-      <w:r>
-        <w:t>Слабая сторона у сигнатур одна: атаки, для которых правило не написано, ими не обнаруживаются. Сюда попадают атаки нулевого дня и обфусцированные варианты ранее известных атак. Поддержание актуальной базы правил требует ручного труда экспертов и выполняется отдельно по каждой угрозе, что плохо согласуется с темпом появления новых вариантов вредоносного программного обеспечения. Правила чувствительны к обходу через мутацию байтовых последовательностей: незначительное изменение шеллкода или заголовка прикладного протокола делает правило неработоспособным до тех пор, пока его не дополнят.</w:t>
+        <w:t>В сигнатурном подходе наблюдаемые пакеты и потоки сравниваются с заранее заданными правилами, описывающими признаки известных атак. Открытые реализации — Snort, Suricata [21] и Zeek [12]. Правила Snort и Suricata записываются как условие над заголовками сетевых протоколов и регулярными выражениями над полезной нагрузкой; Zeek дополняет язык правил скриптовой средой и описывает сценарии на уровне сессий.</w:t>
+      </w:r>
+    </w:p>
+    <w:p>
+      <w:r>
+        <w:t>Сильные стороны сигнатурного подхода — низкая доля ложных срабатываний на классе атак, ранее описанных правилом, и прозрачность диагностики: для каждого срабатывания указываются номер правила и место в трафике, где оно совпало. Размещение сенсора в линии не приводит к заметным потерям пропускной способности. На этих свойствах построена работа большинства промышленных систем обнаружения вторжений.</w:t>
+      </w:r>
+    </w:p>
+    <w:p>
+      <w:r>
+        <w:t>Слабая сторона у сигнатур одна: атаки, для которых правило не написано, ими не обнаруживаются. Сюда попадают атаки нулевого дня и обфусцированные варианты ранее известных атак. Поддержание актуальной базы правил требует ручного труда экспертов и выполняется отдельно по каждой угрозе, что плохо согласуется с темпом появления новых вариантов вредоносного программного обеспечения. Правила чувствительны к обходу через мутацию байтовых последовательностей: незначительное изменение шеллкода или заголовка прикладного протокола нередко выводит атаку из-под действующего правила, хотя сама её природа не меняется.</w:t>
       </w:r>
     </w:p>
     <w:p>
@@ -5711,17 +5721,17 @@
     </w:p>
     <w:p>
       <w:r>
-        <w:t>Поведенческий анализ строится на профиле нормальной активности: фиксируются типичные значения метрик, и затем выявляются статистически значимые отклонения. На уровне потоков профиль формируется агрегированными признаками — частотой обращений к узлам, распределением длительностей сессий, объёмами и направлением передачи. На уровне узлов профилируются типичные программные обращения и графы взаимодействия. Платформа Zeek [12] исторически разрабатывалась как инструмент именно поведенческого анализа: на каждом захваченном пакете сценарий формирует событие, которое сопоставляется с профилем за окно наблюдения.</w:t>
-      </w:r>
-    </w:p>
-    <w:p>
-      <w:r>
-        <w:t>В отличие от сигнатурного подхода, поведенческие методы выявляют атаки нулевого дня: для срабатывания достаточно факта отклонения, а не совпадения с заранее заданным шаблоном. За счёт этого закрываются сценарии, недоступные сигнатурам, — латеральные перемещения во внутренней сети, утечки через нетипичные каналы, медленное сканирование.</w:t>
-      </w:r>
-    </w:p>
-    <w:p>
-      <w:r>
-        <w:t>Ограничения подхода связаны с двумя свойствами реальных корпоративных сетей. Первое — нестационарность распределения трафика: внедрение нового сервиса, изменение топологии или сезонные колебания нагрузки приводят к тому, что профиль, построенный неделей раньше, перестаёт описывать текущее поведение, и доля ложных срабатываний резко возрастает. Второе — слабая интерпретируемость отклонений: оператор получает сигнал о том, что метрика вышла за границы доверительного интервала, но не получает объяснения, какое именно поле события стоит за этим выходом. Из этих ограничений в постановку задачи настоящей работы (подраздел 1.7) перенесено требование к интерпретируемому ответу гибридного метода.</w:t>
+        <w:t>Поведенческий анализ опирается на профиль нормальной активности: фиксируются типичные значения метрик, и затем выявляются статистически значимые отклонения. На уровне потоков профиль формируется агрегированными признаками — частотой обращений к узлам, распределением длительностей сессий, объёмами и направлением передачи. На уровне узлов профилируются типичные программные обращения и графы взаимодействия. Платформа Zeek [12] исторически разрабатывалась как инструмент именно поведенческого анализа: её скриптовая среда позволяет описывать сценарии нормального поведения и условия отклонений.</w:t>
+      </w:r>
+    </w:p>
+    <w:p>
+      <w:r>
+        <w:t>В отличие от сигнатурного подхода, поведенческие методы выявляют атаки нулевого дня: для срабатывания достаточно факта отклонения, а не совпадения с заранее заданным шаблоном. Это закрывает сценарии, недоступные сигнатурам, — латеральные перемещения во внутренней сети, утечки через нетипичные каналы, медленное сканирование.</w:t>
+      </w:r>
+    </w:p>
+    <w:p>
+      <w:r>
+        <w:t>Ограничения подхода связаны с двумя свойствами реальных корпоративных сетей. Первое — нестационарность распределения трафика: внедрение нового сервиса, изменение топологии или сезонные колебания нагрузки приводят к тому, что профиль, построенный неделей раньше, перестаёт описывать текущее поведение, и доля ложных срабатываний резко возрастает. Второе — слабая интерпретируемость отклонений: оператор получает сигнал о том, что метрика вышла за границы доверительного интервала, но не получает объяснения, какое именно изменение в трафике вызвало этот сигнал.</w:t>
       </w:r>
     </w:p>
     <w:p>
@@ -5736,7 +5746,7 @@
     </w:p>
     <w:p>
       <w:r>
-        <w:t>В работе в качестве базовых классификаторов выбраны Random Forest, Logistic Regression и MLP, реализованные средствами библиотеки scikit-learn [8]. Random Forest зафиксирован как опорная базовая модель в силу устойчивости к гиперпараметрам и хорошей применимости к смешанным признакам. Logistic Regression представляет линейный классификатор, MLP — нейронную сеть с одним скрытым слоем. Воспроизводимость обеспечена фиксацией параметра random_state=42 во всех экспериментах.</w:t>
+        <w:t>В работе как базовые классификаторы выбраны Random Forest, Logistic Regression и MLP, реализованные средствами библиотеки scikit-learn [8]. Random Forest зафиксирован как опорная базовая модель: устойчив к гиперпараметрам и хорошо работает на смешанных признаках. Logistic Regression используется как линейный классификатор, MLP — как нейронная сеть с одним скрытым слоем. Воспроизводимость обеспечена фиксацией random_state=42 во всех экспериментах.</w:t>
       </w:r>
     </w:p>
     <w:p>
@@ -5751,7 +5761,7 @@
     </w:p>
     <w:p>
       <w:r>
-        <w:t>Глубокие модели применяются к последовательностям пакетов или окнам потоковых признаков. Свёрточные нейронные сети (1D-CNN) обрабатывают последовательности байтов или признаков как одномерные сигналы; рекуррентные сети LSTM и GRU моделируют временные зависимости; модели на основе архитектуры «трансформер» [13] позволяют учитывать долгосрочные связи. Глубокие модели достигают высоких значений метрик на эталонных наборах, однако требуют значительных ресурсов для обучения и теряют интерпретируемость по сравнению с классическими методами.</w:t>
+        <w:t>Глубокие модели применяются к последовательностям пакетов или окнам потоковых признаков. Свёрточные нейронные сети (1D-CNN) обрабатывают последовательности байтов или признаков как одномерные сигналы; рекуррентные сети LSTM и GRU моделируют временные зависимости; модели на основе архитектуры «трансформер» [13] позволяют учитывать долгосрочные связи. Глубокие модели достигают высоких значений метрик на эталонных наборах, но требуют значительных ресурсов для обучения и теряют интерпретируемость, что в задачах информационной безопасности существенно сказывается на доверии к решению.</w:t>
       </w:r>
     </w:p>
     <w:p>
@@ -5766,47 +5776,7 @@
     </w:p>
     <w:p>
       <w:r>
-        <w:t xml:space="preserve">Оценка качества классификации сетевых событий в работе строится на стандартных метриках машинного обучения. Точность (Precision), полнота (Recall) и F-мера (F1) для отдельного класса </w:t>
-      </w:r>
-      <w:r>
-        <w:rPr>
-          <w:rFonts w:ascii="Cambria Math" w:hAnsi="Cambria Math"/>
-          <w:i/>
-        </w:rPr>
-        <w:t>k</w:t>
-      </w:r>
-      <w:r>
-        <w:t xml:space="preserve"> определяются через элементы матрицы ошибок: истинно положительные срабатывания </w:t>
-      </w:r>
-      <w:r>
-        <w:rPr>
-          <w:rFonts w:ascii="Cambria Math" w:hAnsi="Cambria Math"/>
-          <w:i/>
-        </w:rPr>
-        <w:t>TP_k</w:t>
-      </w:r>
-      <w:r>
-        <w:t xml:space="preserve">, ложно положительные </w:t>
-      </w:r>
-      <w:r>
-        <w:rPr>
-          <w:rFonts w:ascii="Cambria Math" w:hAnsi="Cambria Math"/>
-          <w:i/>
-        </w:rPr>
-        <w:t>FP_k</w:t>
-      </w:r>
-      <w:r>
-        <w:t xml:space="preserve"> и ложно отрицательные </w:t>
-      </w:r>
-      <w:r>
-        <w:rPr>
-          <w:rFonts w:ascii="Cambria Math" w:hAnsi="Cambria Math"/>
-          <w:i/>
-        </w:rPr>
-        <w:t>FN_k</w:t>
-      </w:r>
-      <w:r>
-        <w:t>.</w:t>
+        <w:t>Оценка качества классификации сетевых событий в работе строится на стандартных метриках машинного обучения. Точность (Precision), полнота (Recall) и F-мера (F1) для отдельного класса k определяются через элементы матрицы ошибок: истинно положительные срабатывания TP_k, ложно положительные FP_k и ложно отрицательные FN_k.</w:t>
       </w:r>
     </w:p>
     <w:p>
@@ -6167,17 +6137,7 @@
     </w:p>
     <w:p>
       <w:r>
-        <w:t xml:space="preserve">Для задач с дисбалансом классов и упорядочиванием срабатываний по уверенности применяется метрика площади под кривой «точность — полнота» (Precision-Recall Area Under the Curve, PR-AUC). Кривая строится в координатах </w:t>
-      </w:r>
-      <w:r>
-        <w:rPr>
-          <w:rFonts w:ascii="Cambria Math" w:hAnsi="Cambria Math"/>
-          <w:i/>
-        </w:rPr>
-        <w:t>(Recall, Precision)</w:t>
-      </w:r>
-      <w:r>
-        <w:t xml:space="preserve"> при варьировании порога принятия решения; PR-AUC рассчитывается как интеграл</w:t>
+        <w:t>Для задач с дисбалансом классов и упорядочиванием срабатываний по уверенности применяется метрика площади под кривой «точность — полнота» (Precision-Recall Area Under the Curve, PR-AUC). Кривая строится в координатах (Recall, Precision) при варьировании порога принятия решения; PR-AUC рассчитывается как интеграл</w:t>
       </w:r>
     </w:p>
     <w:p>
@@ -6328,52 +6288,32 @@
     </w:p>
     <w:p>
       <w:r>
-        <w:t>В отличие от ROC-AUC, метрика PR-AUC более устойчива при сильном дисбалансе классов, поскольку не учитывает истинно отрицательные срабатывания, доминирующие в задачах обнаружения атак. Численно PR-AUC рассчитывается методом средних точек или через формулу средней точности (Average Precision).</w:t>
-      </w:r>
-    </w:p>
-    <w:p>
-      <w:r>
-        <w:t xml:space="preserve">Дополнительно в задачах обнаружения вторжений применяются метрики уровня ложной тревоги (False Alarm Rate, </w:t>
-      </w:r>
-      <w:r>
-        <w:rPr>
-          <w:rFonts w:ascii="Cambria Math" w:hAnsi="Cambria Math"/>
-          <w:i/>
-        </w:rPr>
-        <w:t>FAR = FP / (FP + TN)</w:t>
-      </w:r>
-      <w:r>
-        <w:t xml:space="preserve">) и пропусков (Miss Rate, </w:t>
-      </w:r>
-      <w:r>
-        <w:rPr>
-          <w:rFonts w:ascii="Cambria Math" w:hAnsi="Cambria Math"/>
-          <w:i/>
-        </w:rPr>
-        <w:t>MR = FN / (TP + FN)</w:t>
-      </w:r>
-      <w:r>
-        <w:t>). FAR характеризует долю ошибочных срабатываний на фоновом трафике и связан с операционной нагрузкой на аналитика; MR характеризует долю пропущенных атак и связан с риском компрометации.</w:t>
-      </w:r>
-    </w:p>
-    <w:p>
-      <w:r>
-        <w:t>При оценке гибридных методов, использующих языковые модели, существенны метрики производительности: средняя задержка ответа (latency) на одно событие в миллисекундах или секундах и пропускная способность (throughput) в событиях в секунду. Для сравнения настоящего гибридного метода с базовыми классификаторами указанные метрики приведены в главе 3 и иллюстрируют ограничения локального исполнения языковых моделей на CPU.</w:t>
-      </w:r>
-    </w:p>
-    <w:p>
-      <w:r>
-        <w:t>Стоимостные метрики (cost-sensitive metrics), назначающие различные веса ошибкам разных типов в соответствии с операционной стоимостью пропуска атаки или ложного срабатывания, в работе не применяются, так как требуют установления цены ошибки в конкретной операционной среде, что выходит за рамки исследования.</w:t>
-      </w:r>
-    </w:p>
-    <w:p>
-      <w:r>
-        <w:t>При сравнении классификаторов в задачах с дисбалансом классов важно соответствие усреднения метрик целевой задаче. Макроусреднение F1 позволяет выявить случаи, в которых классификатор «прячется» за крупным фоновым классом. Взвешенное усреднение, напротив, отражает интегральное качество, согласованное с распределением классов в выборке. Для эталонных наборов с заметным дисбалансом, к которым относится UNSW-NB15, в работе принят порядок отчётности, при котором приводятся обе формы усреднения, и приоритетной для содержательных выводов считается макроформа.</w:t>
-      </w:r>
-    </w:p>
-    <w:p>
-      <w:r>
-        <w:t>Для оценки качества выходных данных языковой модели, помимо классификационных метрик, в работе используется метрика интегрированности факт-чека, отражающая долю событий, для которых хотя бы один путь из поля evidence, возвращаемого моделью, не разрешается в исходный NetworkEvent. Указанная метрика характеризует устойчивость модели к галлюцинациям и контролируется на постфильтрационном этапе шлюза. На уровне реализации метрика отражена флагом evidence_filtered, формируемым процедурой _postprocess_evidence.</w:t>
+        <w:t>В отличие от ROC-AUC, метрика PR-AUC устойчивее при сильном дисбалансе классов, поскольку не учитывает истинно отрицательные срабатывания, доминирующие в задачах обнаружения атак. Численно PR-AUC рассчитывается методом средних точек или через формулу средней точности (Average Precision).</w:t>
+      </w:r>
+    </w:p>
+    <w:p>
+      <w:r>
+        <w:t>Дополнительно в задачах обнаружения вторжений применяются метрики уровня ложной тревоги (False Alarm Rate, FAR = FP / (FP + TN)) и пропусков (Miss Rate, MR = FN / (TP + FN)). FAR характеризует долю ошибочных срабатываний на фоновом трафике и связан с операционной нагрузкой на аналитика; MR — долю пропущенных атак и связан с риском компрометации.</w:t>
+      </w:r>
+    </w:p>
+    <w:p>
+      <w:r>
+        <w:t>При оценке гибридных методов с языковыми моделями важны метрики производительности: средняя задержка ответа (latency) на одно событие в миллисекундах или секундах и пропускная способность (throughput) в событиях в секунду. Для сравнения настоящего гибридного метода с базовыми классификаторами эти метрики приведены в главе 3 и иллюстрируют ограничения локального исполнения языковых моделей на CPU.</w:t>
+      </w:r>
+    </w:p>
+    <w:p>
+      <w:r>
+        <w:t>Стоимостные метрики (cost-sensitive metrics), назначающие разные веса ошибкам разных типов в соответствии с операционной стоимостью пропуска атаки или ложного срабатывания, в работе не применяются: они требуют установления цены ошибки в конкретной операционной среде, что выходит за рамки исследования.</w:t>
+      </w:r>
+    </w:p>
+    <w:p>
+      <w:r>
+        <w:t>При сравнении классификаторов в задачах с дисбалансом классов важно соответствие усреднения метрик целевой задаче. Макроусреднение F1 позволяет выявить случаи, в которых классификатор «прячется» за крупным фоновым классом. Взвешенное усреднение, напротив, отражает интегральное качество, согласованное с распределением классов в выборке. Для эталонных наборов с заметным дисбалансом, к которым относится UNSW-NB15, в работе принят порядок отчётности: приводятся обе формы усреднения, а приоритет отдаётся макроусреднению при оценке устойчивости классификатора к редким классам атак.</w:t>
+      </w:r>
+    </w:p>
+    <w:p>
+      <w:r>
+        <w:t>Для оценки качества выходных данных языковой модели, помимо классификационных метрик, в работе используется метрика интегрированности факт-чека: доля событий, для которых хотя бы один путь из поля evidence, возвращаемого моделью, не разрешается в исходный NetworkEvent. Эта метрика характеризует устойчивость модели к галлюцинациям и контролируется на постфильтрационном этапе шлюза. На уровне реализации она отражена флагом evidence_filtered, формируемым процедурой _postprocess_evidence в шлюзе LLM Gateway (глава 3).</w:t>
       </w:r>
     </w:p>
     <w:p>
@@ -6388,12 +6328,12 @@
     </w:p>
     <w:p>
       <w:r>
-        <w:t>Под большой языковой моделью в работе понимается обученная на большом текстовом корпусе нейронная сеть архитектуры «трансформер» [13], решающая задачу авторегрессивного предсказания следующего токена. В этом режиме модель применима к классификации текста, в том числе к классификации текстовых описаний сетевых событий. В отличие от моделей, обученных непосредственно на размеченном трафике, большая языковая модель использует знания из исходного корпуса предобучения и не требует переобучения на каждый новый протокол.</w:t>
-      </w:r>
-    </w:p>
-    <w:p>
-      <w:r>
-        <w:t>Открытые модели семейств Llama [16; 24], Mistral [17], Phi-3 [18] и Gemma [19] обучались на универсальных корпусах естественного языка и программного кода и не специализировались на классификации сетевого трафика. Свойства этих моделей в задаче анализа трафика унаследованы от исходного контекста обучения, а не получены целевым дообучением; этим определяются границы применимости метода и ожидания по качеству, проверяемые экспериментально в главе 3. Подразделы 1.4.1–1.4.3 раскрывают архитектурные основы больших языковых моделей, варианты локального исполнения и ограничения, важные для задачи анализа трафика.</w:t>
+        <w:t>Под большой языковой моделью в работе понимается обученная на большом текстовом корпусе нейронная сеть архитектуры «трансформер» [13], решающая задачу авторегрессивного предсказания следующего токена. В этом режиме модель применима к классификации текста, в том числе к классификации текстовых описаний сетевых событий. В отличие от моделей, обученных непосредственно на размеченном трафике, большая языковая модель использует знания из исходного корпуса предобучения и не требует переобучения на каждый новый класс атак.</w:t>
+      </w:r>
+    </w:p>
+    <w:p>
+      <w:r>
+        <w:t>Открытые модели семейств Llama [16; 24], Mistral [17], Phi-3 [18] и Gemma [19] обучались на универсальных корпусах естественного языка и программного кода и не специализировались на классификации сетевого трафика. Свойства этих моделей в задаче анализа трафика унаследованы от исходного контекста обучения, а не получены целевым дообучением; этим определяются границы применимости метода и ожидания по качеству, проверяемые экспериментально в главе 3. Подразделы 1.4.1–1.4.3 раскрывают архитектурные детали и связанные с ними ограничения.</w:t>
       </w:r>
     </w:p>
     <w:p>
@@ -6408,7 +6348,7 @@
     </w:p>
     <w:p>
       <w:r>
-        <w:t>Жизненный цикл подготовки языковой модели включает этап преобучения (pretraining) на массивных текстовых корпусах, этап донастройки на инструкциях (instruction tuning) с использованием диалоговых пар «инструкция — ответ» и этап выравнивания на предпочтениях (RLHF, Direct Preference Optimization), направленный на согласование поведения модели с предпочтениями пользователей. Размеры моделей измеряются числом параметров — от единиц миллиардов (модели семейств Phi-3 Mini, Llama 3 8B) до десятков и сотен миллиардов (модели семейств Llama 3 70B, Mistral Large).</w:t>
+        <w:t>Жизненный цикл подготовки языковой модели включает преобучение (pretraining) на массивных текстовых корпусах, донастройку на инструкциях (instruction tuning) с использованием диалоговых пар «инструкция — ответ» и выравнивание на предпочтениях (RLHF, Direct Preference Optimization), направленное на согласование поведения модели с предпочтениями пользователей. Размеры моделей измеряются числом параметров — от единиц миллиардов (Phi-3 Mini, Llama 3 8B) до десятков и сотен миллиардов. Архитектура трансформера [13] показана на Рисунке 1.</w:t>
       </w:r>
     </w:p>
     <w:p>
@@ -6435,7 +6375,7 @@
                     </pic:cNvPicPr>
                   </pic:nvPicPr>
                   <pic:blipFill>
-                    <a:blip r:embed="rId7"/>
+                    <a:blip r:embed="rId12"/>
                     <a:stretch>
                       <a:fillRect/>
                     </a:stretch>
@@ -6468,8 +6408,6 @@
         </w:rPr>
         <w:t>Рисунок 1 — Архитектура трансформера: Input/Output Embedding — входной/выходной эмбеддинг, Positional Encoding — позиционное кодирование, Multi-Head Attention — многоголовое внимание, Masked Multi-Head Attention — маскированное многоголовое внимание, Feed Forward — полносвязный слой, Add &amp; Norm — сложение и нормализация, Linear — линейный слой, Softmax — функция Softmax, Output Probabilities — распределение вероятностей выходных токенов</w:t>
       </w:r>
-      <w:bookmarkStart w:id="61" w:name="_GoBack"/>
-      <w:bookmarkEnd w:id="61"/>
     </w:p>
     <w:p>
       <w:pPr>
@@ -6483,7 +6421,7 @@
     </w:p>
     <w:p>
       <w:r>
-        <w:t>Локальные движки исполнения языковых моделей обеспечивают инференс на оборудовании пользователя без передачи данных во внешние сервисы. Наиболее распространённые открытые движки — Ollama [14], llama.cpp и vLLM. Все они оптимизируют выполнение моделей семейств Llama, Mistral, Phi-3, Gemma и других, используя различные форматы квантизации (GGUF, GPTQ, AWQ) для снижения требований к памяти. Сравнительная характеристика указанных движков приведена в таблице 2.</w:t>
+        <w:t>Локальные движки исполнения языковых моделей обеспечивают инференс на оборудовании пользователя без передачи данных во внешние сервисы. Наиболее распространённые открытые движки — Ollama [14], llama.cpp и vLLM. Все они оптимизируют выполнение моделей семейств Llama, Mistral, Phi-3, Gemma и других, применяя различные форматы квантизации (GGUF, GPTQ, AWQ) для снижения требований к памяти. Сравнительная характеристика указанных движков приведена в Таблице 2.</w:t>
       </w:r>
     </w:p>
     <w:p>
@@ -6498,7 +6436,7 @@
     </w:p>
     <w:p>
       <w:r>
-        <w:t>Применение языковых моделей к задаче анализа трафика связано с рядом принципиальных ограничений. Первое ограничение — галлюцинации: способность модели уверенно выдавать факты, не подтверждённые входными данными. Применительно к настоящей работе галлюцинацией является ситуация, при которой модель в поле evidence указывает путь, не существующий в исходном NetworkEvent. Для парирования данной угрозы в шлюзе предусмотрена постфильтрация поля evidence по фактическому наличию пути в исходном объекте.</w:t>
+        <w:t>Применение языковых моделей к задаче анализа трафика связано с рядом принципиальных ограничений. Первое — галлюцинации: модель может уверенно выдавать факты, не подтверждённые входными данными. В настоящей работе галлюцинацией считается ситуация, при которой модель в поле evidence указывает путь, не существующий в исходном NetworkEvent. Для парирования этой угрозы в шлюзе предусмотрена постфильтрация поля evidence по фактическому наличию пути в исходном объекте. Второе ограничение — низкая пропускная способность при локальном исполнении на CPU: задержка инференса на типовых конфигурациях достигает единиц секунд на одно событие, что не позволяет применять метод к потоковому анализу высокоскоростного трафика. Третье — недетерминированность вывода при ненулевой температуре генерации; в работе температура зафиксирована на уровне 0.0 для повышения воспроизводимости.</w:t>
       </w:r>
     </w:p>
     <w:p>
@@ -6513,7 +6451,7 @@
     </w:p>
     <w:p>
       <w:r>
-        <w:t>Существующие реализации с использованием больших языковых моделей применительно к анализу трафика делятся на две группы. Первая — облачные расширения коммерческих анализаторов и SIEM-платформ, в которых языковая модель размещается за периметром оператора и принимает на вход уже подготовленные журналы или фрагменты pcap-файлов. Вторая — исследовательские прототипы, в которых авторы либо дообучают открытые модели на размеченных наборах сетевого трафика, либо проектируют схему промпта поверх предобученной модели без её модификации. Первая группа разбирается в подразделе 1.5.1, вторая — в подразделе 1.5.2.</w:t>
+        <w:t>Существующие реализации с использованием больших языковых моделей применительно к анализу трафика делятся на две группы. Первая — облачные расширения коммерческих анализаторов и SIEM-платформ, в которых языковая модель размещается за периметром оператора и принимает на вход уже подготовленные журналы или фрагменты pcap-файлов. Вторая — исследовательские прототипы, в которых авторы либо дообучают открытые модели на размеченных наборах сетевого трафика, либо проектируют схему промпта поверх предобученной модели без её дообучения.</w:t>
       </w:r>
     </w:p>
     <w:p>
@@ -6528,7 +6466,7 @@
     </w:p>
     <w:p>
       <w:r>
-        <w:t>В практике анализа трафика распространены расширения для анализатора Wireshark, использующие облачные сервисы языковых моделей для интерпретации захваченных пакетов. Расширения данного класса передают фрагменты pcap-файла во внешний API, что несовместимо с требованием локальной обработки и нарушает принцип минимизации передачи данных. Основным преимуществом облачных расширений является доступ к моделям наибольшего размера и высокому качеству ответов; основными недостатками — зависимость от внешнего сервиса, риск утечки данных и невозможность аудита поведения модели.</w:t>
+        <w:t>В практике анализа трафика распространены расширения для Wireshark, использующие облачные сервисы языковых моделей для интерпретации захваченных пакетов. Расширения этого класса передают фрагменты pcap-файла во внешний API, что несовместимо с требованием локальной обработки и нарушает принцип минимизации передачи данных. Главное преимущество облачных расширений — доступ к моделям наибольшего размера и высокому качеству ответов; недостатки — зависимость от внешнего канала связи, передача потенциально чувствительных данных третьей стороне и невозможность применения в средах с замкнутым контуром.</w:t>
       </w:r>
     </w:p>
     <w:p>
@@ -6543,17 +6481,17 @@
     </w:p>
     <w:p>
       <w:r>
-        <w:t>Из опубликованных исследовательских прототипов известна работа NetGPT [20]. В ней генеративная модель типа «трансформер» дообучается на парах «байтовая последовательность пакета — текстовая метка протокола или класса атаки». Авторы показывают, что дообучение на сравнительно небольшой выборке размеченного трафика повышает качество классификации до уровня классических методов машинного обучения; при этом модель сохраняет способность генерировать текстовые описания результата. Аналогичный подход реализован в работах семейства TrafficLLM: на вход модели подаются текстовые сериализации пакетных и потоковых признаков, а сама модель дообучается на классификацию.</w:t>
-      </w:r>
-    </w:p>
-    <w:p>
-      <w:r>
-        <w:t>Архитектурно эти прототипы отличаются от гибридного метода настоящей работы. NetGPT [20] и TrafficLLM требуют размеченного набора трафика и вычислительной инфраструктуры для дообучения модели на этом наборе; стоимость инженерии признаков перенесена в обучающую процедуру и закрепляется в весах модели. В подходе настоящей работы модель не дообучается, а инженерия признаков перенесена в детерминированный модуль трансляции pcap в JSON Schema (глава 2). Из этого следуют три отличия. Во-первых, метод применим без размеченного набора и не требует разметки на каждый новый протокол. Во-вторых, замена одной локальной модели другой не приводит к необходимости повторного дообучения и сводится к смене одного параметра конфигурации. В-третьих, исполнение не требует графической карты с большим объёмом памяти: дообучения не происходит, а инференс на малых моделях (Phi-3 Mini [18], Mistral-7B [17]) выполняется на центральном процессоре.</w:t>
-      </w:r>
-    </w:p>
-    <w:p>
-      <w:r>
-        <w:t>У всех этих прототипов есть общая слабая сторона — отсутствие формального протокола нормализации pcap-данных. Каждый прототип задаёт собственный, неявно описанный формат входа модели; контракт между блоком нормализации и блоком модели зафиксирован только в исходном коде авторов и не выносится во внешнюю спецификацию. Поэтому воспроизвести прототип независимым исследователям трудно, а переносить результаты между моделями приходится с переписыванием кода. В настоящей работе это ограничение снимается формальной двухуровневой схемой NetworkEvent (подраздел 2.2; задача 2 введения).</w:t>
+        <w:t>Из опубликованных исследовательских прототипов известна работа NetGPT [20]. В ней генеративная модель типа «трансформер» дообучается на парах «байтовая последовательность пакета — текстовая метка протокола или класса атаки». Авторы показывают, что дообучение на сравнительно небольшой выборке размеченного трафика повышает качество классификации до уровня классических методов машинного обучения; при этом модель сохраняет способность генерировать текстовые описания результата. Аналогичный подход реализован в проекте TrafficLLM, в котором применяется дообучение модели семейства Llama на пакетных и потоковых признаках. Оба прототипа требуют размеченного набора трафика и вычислительной инфраструктуры для дообучения.</w:t>
+      </w:r>
+    </w:p>
+    <w:p>
+      <w:r>
+        <w:t>Архитектурно эти прототипы отличаются от гибридного метода настоящей работы. NetGPT [20] и TrafficLLM требуют размеченного набора трафика и вычислительной инфраструктуры для дообучения модели на этом наборе; стоимость инженерии признаков перенесена в обучающую процедуру и закрепляется в весах модели. В подходе настоящей работы модель не дообучается, а инженерия признаков перенесена в детерминированный модуль трансляции pcap в JSON Schema (глава 2). Из этого следуют три отличия. Во-первых, метод применим без размеченного набора трафика: достаточно только pcap-файла. Во-вторых, замена локальной модели в нём не требует переобучения. В-третьих, метод исполняется на CPU без GPU-инфраструктуры.</w:t>
+      </w:r>
+    </w:p>
+    <w:p>
+      <w:r>
+        <w:t>У всех этих прототипов есть общая слабая сторона — отсутствие формального протокола нормализации pcap-данных. Каждый прототип задаёт собственный, неявно описанный формат входа модели; контракт между блоком нормализации и блоком модели зафиксирован только в исходном коде авторов и не выносится во внешнюю спецификацию. Поэтому воспроизвести прототип независимым исследователям трудно, а переносить результаты между моделями приходится с переписыванием кода. В настоящей работе это ограничение снимается формальной двухуровневой схемой NetworkEvent, описанной в главе 2: контракт между блоком нормализации и шлюзом языковой модели зафиксирован JSON Schema 2020-12 [4] и доступен любому внешнему потребителю без знакомства с реализацией.</w:t>
       </w:r>
     </w:p>
     <w:p>
@@ -6578,7 +6516,7 @@
     </w:p>
     <w:p>
       <w:r>
-        <w:t>Применительно к разрабатываемому решению наиболее существенны позиции LLM01 (инъекции инструкций через поле app_summary), LLM02 (несоблюдение схемы ответа), LLM06 (попадание чувствительных данных в журналы или промпт), LLM09 (чрезмерное доверие к решению модели без проверки фактического присутствия указанных в evidence полей в исходных данных). Указанные угрозы и контрмеры детально рассматриваются в главе 4 в составе модели угроз; в настоящей главе фиксируются концептуальные положения.</w:t>
+        <w:t>Применительно к разрабатываемому решению наиболее существенны позиции LLM01 (инъекции инструкций через поле app_summary), LLM02 (несоблюдение схемы ответа), LLM06 (попадание чувствительных данных в журналы или промпт), LLM09 (чрезмерное доверие к решению модели без проверки фактического присутствия указанных в evidence полей в исходных данных). Эти угрозы и контрмеры подробно рассматриваются в главе 4 в составе модели угроз; в настоящей главе фиксируются концептуальные положения.</w:t>
       </w:r>
     </w:p>
     <w:p>
@@ -6593,7 +6531,7 @@
     </w:p>
     <w:p>
       <w:r>
-        <w:t>Положения банка данных угроз ФСТЭК и реестра OWASP Top 10 for LLM Applications не противоречат друг другу: первый описывает угрозы информационной системы в целом и используется при оценке соответствия по российским нормативным документам, второй — специфические угрозы приложений на основе языковых моделей и используется как методическое пособие при проектировании контура защиты. В главе 4 указанные источники используются совместно: модель угроз построена в логике методики ФСТЭК-2021, при этом конкретные нарушители и способы реализации угроз сопоставлены с позициями OWASP Top 10 for LLM.</w:t>
+        <w:t>Положения банка данных угроз ФСТЭК и реестра OWASP Top 10 for LLM Applications не противоречат друг другу: первый описывает угрозы информационной системы в целом и используется при оценке соответствия по российским нормативным документам, второй — специфические угрозы приложений на основе языковых моделей и используется как методическое пособие при проектировании контура защиты. В главе 4 указанные источники используются совместно: модель угроз построена в логике методики ФСТЭК-2021, при этом контрмеры на уровне БЯМ опираются на категории OWASP Top 10.</w:t>
       </w:r>
     </w:p>
     <w:p>
@@ -6602,7 +6540,7 @@
         <w:jc w:val="both"/>
       </w:pPr>
       <w:r>
-        <w:t>Согласно описанию на официальном сайте bdu.fstec.ru, банк данных угроз безопасности информации формируется ФСТЭК России в соответствии с подпунктом 21 пункта 8 Положения о Федеральной службе по техническому и экспортному контролю, утверждённого Указом Президента Российской Федерации от 16 августа 2004 г. № 1085, во взаимодействии с заинтересованными федеральными органами исполнительной власти и организациями. Банк данных предназначен для использования при проведении работ по обеспечению безопасности информации в ходе разработки, эксплуатации и оценки соответствия систем и сетей, обрабатывающих информацию ограниченного доступа, и содержит сведения об основных угрозах безопасности информации и уязвимостях, характерных для информационных систем и сетей [21].</w:t>
+        <w:t>Согласно описанию на официальном сайте bdu.fstec.ru, банк данных угроз безопасности информации формируется ФСТЭК России в соответствии с подпунктом 21 пункта 8 Положения о Федеральной службе по техническому и экспортному контролю, утверждённого Указом Президента Российской Федерации от 16 августа 2004 г. № 1085, во взаимодействии с заинтересованными федеральными органами исполнительной власти и организациями. Банк данных предназначен для использования при проведении работ по обеспечению безопасности информации в ходе оценки угроз информационной безопасности, разработки моделей угроз и планирования защитных мер.</w:t>
       </w:r>
     </w:p>
     <w:p>
@@ -6617,7 +6555,7 @@
     </w:p>
     <w:p>
       <w:r>
-        <w:t>Методика оценки угроз безопасности информации, утверждённая ФСТЭК России в 2021 году [15], устанавливает порядок построения модели угроз для информационных систем. Методика предусматривает описание объекта защиты, выделение нарушителей и оценку их потенциала, идентификацию способов реализации угроз и оценку возможности и последствий реализации каждой угрозы. Применение методики к разрабатываемому решению Local Packet Whisperer выполнено в главе 4. В настоящей главе фиксируется выбор методики ФСТЭК-2021 как нормативного основания для модели угроз и обосновывается её предпочтение по сравнению с альтернативными подходами (отраслевые методики, методики на основе ISO/IEC 27005). Выбор обусловлен следующими соображениями: настоящая работа выполняется в российской регуляторной среде; целевые потребители результата — подразделения информационной безопасности государственных и корпоративных организаций, для которых соответствие методике ФСТЭК является нормативным требованием; методика покрывает полный жизненный цикл оценки угроз и согласована с банком данных угроз ФСТЭК.</w:t>
+        <w:t>Методика оценки угроз безопасности информации, утверждённая ФСТЭК России в 2021 году [15], устанавливает порядок построения модели угроз для информационных систем. Методика предусматривает описание объекта защиты, выделение нарушителей и оценку их потенциала, идентификацию способов реализации угроз и оценку возможности и последствий реализации каждой угрозы. Применение методики к разрабатываемому решению Traffic analyzer выполнено в главе 4. В настоящей главе фиксируется выбор методики ФСТЭК-2021 как нормативного основания для модели угроз.</w:t>
       </w:r>
     </w:p>
     <w:p>
@@ -6632,27 +6570,27 @@
     </w:p>
     <w:p>
       <w:r>
-        <w:t>Выполненный аналитический обзор позволяет сформулировать следующие положения, обосновывающие постановку задачи настоящей работы.</w:t>
-      </w:r>
-    </w:p>
-    <w:p>
-      <w:r>
-        <w:t>Во-первых, базовые методы машинного обучения (Random Forest, Logistic Regression, MLP) на признаках потокового уровня обеспечивают высокое качество классификации в пределах закрытого набора классов, фиксированного на этапе обучения, однако не предоставляют объяснений для оператора и теряют качество при сдвиге распределения данных. Это ограничение выводит из поля зрения базовых методов сценарии анализа атак, не представленных в обучающей выборке, и снижает применимость в условиях быстрого изменения сетевой инфраструктуры.</w:t>
-      </w:r>
-    </w:p>
-    <w:p>
-      <w:r>
-        <w:t>Во-вторых, облачные языковые модели обеспечивают высокое качество классификации и способны давать объяснения, однако несовместимы с требованием локальной обработки чувствительных данных. Передача дампов трафика во внешние сервисы не допустима в условиях, требующих соответствия методике ФСТЭК-2021 и банку данных угроз ФСТЭК.</w:t>
-      </w:r>
-    </w:p>
-    <w:p>
-      <w:r>
-        <w:t>В-третьих, локальные языковые модели в режиме JSON-mode способны давать структурированные ответы пригодного для дальнейшей обработки качества, однако в существующих исследовательских прототипах отсутствует единый формальный протокол нормализации pcap-данных, контракт между блоком нормализации и блоком модели определён неявно, а гарантии валидности ответа отсутствуют. Это создаёт условия для возникновения ошибок передачи и интерпретации, не воспроизводимости результатов и неспособности интегрировать решение в существующие процессы анализа.</w:t>
-      </w:r>
-    </w:p>
-    <w:p>
-      <w:r>
-        <w:t>На основании указанных положений в настоящей работе предлагается комплекс методов, включающий: формальную двухуровневую схему NetworkEvent для нормализации pcap-данных; шлюз локальной языковой модели в режиме JSON-mode с обязательной валидацией ответа и повторным запросом по уточняющему промпту; механизм санитизации поля прикладной сводки против инъекций инструкций; параллельный базовый классификатор на тех же данных и единой таксономии угроз для воспроизводимого сравнения качества.</w:t>
+        <w:t>Выполненный аналитический обзор позволяет сформулировать положения, обосновывающие постановку задачи настоящей работы.</w:t>
+      </w:r>
+    </w:p>
+    <w:p>
+      <w:r>
+        <w:t>Во-первых, базовые методы машинного обучения (Random Forest, Logistic Regression, MLP) на признаках потокового уровня обеспечивают высокое качество классификации в пределах закрытого набора классов, фиксированного на этапе обучения, но не дают объяснений для оператора и теряют качество при сдвиге распределения данных. Это ограничение выводит из поля зрения базовых методов сценарии анализа атак, не представленных в обучающей выборке, и снижает применимость в условиях быстрого изменения ландшафта угроз.</w:t>
+      </w:r>
+    </w:p>
+    <w:p>
+      <w:r>
+        <w:t>Во-вторых, облачные языковые модели обеспечивают высокое качество классификации и дают объяснения, но несовместимы с требованием локальной обработки чувствительных данных. Передача дампов трафика во внешние сервисы недопустима в условиях, требующих соответствия методике ФСТЭК-2021 и банку данных угроз ФСТЭК.</w:t>
+      </w:r>
+    </w:p>
+    <w:p>
+      <w:r>
+        <w:t>В-третьих, локальные языковые модели в режиме JSON-mode способны давать структурированные ответы пригодного для дальнейшей обработки качества, но в существующих исследовательских прототипах отсутствует единый формальный протокол нормализации pcap-данных, контракт между блоком нормализации и блоком модели определён неявно, а гарантии валидности ответа отсутствуют. Это создаёт условия для возникновения ошибок передачи и интерпретации, не воспроизводимости результатов и неспособности интегрировать результат в типовые средства защиты информации.</w:t>
+      </w:r>
+    </w:p>
+    <w:p>
+      <w:r>
+        <w:t>На основании указанных положений в работе предлагается комплекс методов: формальная двухуровневая схема NetworkEvent для нормализации pcap-данных; шлюз локальной языковой модели в режиме JSON-mode с обязательной валидацией ответа и повторным запросом по уточняющему промпту; механизм санитизации поля прикладной сводки против инъекций инструкций; параллельный базовый классификатор на тех же данных и единой таксономии угроз для воспроизводимого сравнения качества.</w:t>
       </w:r>
     </w:p>
     <w:p>
@@ -6712,37 +6650,37 @@
     </w:p>
     <w:p>
       <w:r>
-        <w:t>По результатам аналитического обзора сформулированы следующие выводы.</w:t>
-      </w:r>
-    </w:p>
-    <w:p>
-      <w:r>
-        <w:t>Первое. Существующие сигнатурные системы обнаружения вторжений (Snort, Suricata, Zeek) обеспечивают низкий уровень ложных срабатываний на известных атаках, однако принципиально не способны обнаруживать ранее неизвестные атаки и требуют непрерывной поддержки базы правил.</w:t>
-      </w:r>
-    </w:p>
-    <w:p>
-      <w:r>
-        <w:t>Второе. Классические методы машинного обучения (Random Forest, Logistic Regression, MLP) на признаках потокового уровня, рассчитанных средствами CICFlowMeter, обеспечивают высокое качество классификации в закрытом наборе классов, но не предоставляют объяснений для оператора и подвержены деградации при сдвиге распределения данных. В настоящей работе указанные методы используются как базовая линия сравнения.</w:t>
-      </w:r>
-    </w:p>
-    <w:p>
-      <w:r>
-        <w:t>Третье. Локальные языковые модели семейств Phi-3, Llama, Mistral, Gemma в режиме JSON-mode, исполняемые в среде Ollama, дают возможность строить классификаторы сетевых событий с приемлемыми требованиями к аппаратным ресурсам и без передачи данных во внешние сервисы. Существенным ограничением является более низкое качество классификации по сравнению с базовыми методами и необходимость отдельного контура защиты от специфических угроз языковых моделей.</w:t>
-      </w:r>
-    </w:p>
-    <w:p>
-      <w:r>
-        <w:t>Четвёртое. Угрозы информационной безопасности, специфические для приложений на основе языковых моделей, систематизированы в реестре OWASP Top 10 for LLM Applications и могут быть согласованы с банком данных угроз ФСТЭК России. Методика оценки угроз ФСТЭК России 2021 года выбрана в качестве нормативного основания для модели угроз разрабатываемого решения.</w:t>
-      </w:r>
-    </w:p>
-    <w:p>
-      <w:r>
-        <w:t>Пятое. На основании обзора в работе предлагается комплекс методов, включающий двухуровневую схему NetworkEvent для нормализации pcap-данных, шлюз локальной языковой модели в режиме JSON-mode с гарантиями валидности ответа, механизм санитизации против инъекций инструкций и параллельный базовый классификатор для воспроизводимого сравнения качества. Сформулированы три критерия выбора локальной модели (О-1, О-2, О-3) и три нефункциональных требования (НФТ-1, НФТ-2, НФТ-3), используемые в дальнейших главах при принятии архитектурных решений.</w:t>
-      </w:r>
-    </w:p>
-    <w:p>
-      <w:r>
-        <w:t>Полученные в настоящей главе результаты служат основанием для перехода к описанию формальной модели и архитектуры разрабатываемого решения в главе 2, в которой представлены формализация двухуровневой схемы NetworkEvent, описание метода трансляции pcap в схему и далее в промпт, а также архитектурные решения шлюза локальной языковой модели. Экспериментальная часть, включающая программную реализацию и количественную оценку метода на наборе UNSW-NB15, изложена в главе 3. Модель угроз и политики безопасности, построенные в соответствии с методикой ФСТЭК России 2021 года, представлены в главе 4.</w:t>
+        <w:t>По результатам аналитического обзора сформулированы выводы.</w:t>
+      </w:r>
+    </w:p>
+    <w:p>
+      <w:r>
+        <w:t>Первое. Существующие сигнатурные системы обнаружения вторжений (Snort, Suricata, Zeek) обеспечивают низкий уровень ложных срабатываний на известных атаках, но не способны обнаруживать ранее неизвестные атаки и требуют непрерывной поддержки базы правил.</w:t>
+      </w:r>
+    </w:p>
+    <w:p>
+      <w:r>
+        <w:t>Второе. Классические методы машинного обучения (Random Forest, Logistic Regression, MLP) на признаках потокового уровня, рассчитанных средствами CICFlowMeter, обеспечивают высокое качество классификации в закрытом наборе классов, но не дают объяснений оператору и подвержены деградации при сдвиге распределения данных. В настоящей работе они используются как базовая линия сравнения.</w:t>
+      </w:r>
+    </w:p>
+    <w:p>
+      <w:r>
+        <w:t>Третье. Локальные языковые модели семейств Phi-3, Llama, Mistral, Gemma в режиме JSON-mode, исполняемые в среде Ollama, позволяют строить классификаторы сетевых событий с приемлемыми требованиями к аппаратным ресурсам и без передачи данных во внешние сервисы. Существенное ограничение — более низкое качество классификации по сравнению с базовыми методами и необходимость отдельного контура защиты от специфических угроз языковых моделей.</w:t>
+      </w:r>
+    </w:p>
+    <w:p>
+      <w:r>
+        <w:t>Четвёртое. Угрозы информационной безопасности, специфические для приложений на основе языковых моделей, систематизированы в реестре OWASP Top 10 for LLM Applications и согласуются с банком данных угроз ФСТЭК России. Методика оценки угроз ФСТЭК России 2021 года выбрана как нормативное основание для модели угроз разрабатываемого решения.</w:t>
+      </w:r>
+    </w:p>
+    <w:p>
+      <w:r>
+        <w:t>Пятое. На основании обзора в работе предлагается комплекс методов: двухуровневая схема NetworkEvent для нормализации pcap-данных, шлюз локальной языковой модели в режиме JSON-mode с гарантиями валидности ответа, механизм санитизации против инъекций инструкций и параллельный базовый классификатор для воспроизводимого сравнения качества. Сформулированы три критерия выбора локальной модели (О-1, О-2, О-3) и три нефункциональных требования (НФТ-1, НФТ-2, НФТ-3), используемые в дальнейших главах.</w:t>
+      </w:r>
+    </w:p>
+    <w:p>
+      <w:r>
+        <w:t>Полученные в главе результаты служат основанием для перехода к описанию формальной модели и архитектуры разрабатываемого решения в главе 2, где приводятся формализация двухуровневой схемы NetworkEvent, описание метода трансляции pcap в схему и далее в промпт, а также архитектурные решения шлюза локальной языковой модели. Экспериментальная часть с программной реализацией и количественной оценкой метода на наборе UNSW-NB15 изложена в главе 3. Модель угроз и политики безопасности приведены в главе 4.</w:t>
       </w:r>
     </w:p>
     <w:p/>
@@ -6758,7 +6696,7 @@
     </w:p>
     <w:p>
       <w:r>
-        <w:t>В главе представлены результаты проектной части работы: формальная двухуровневая схема структурированного представления сетевого события, метод трансляции пакетного трафика в промпт локальной языковой модели, архитектура программного решения и обоснование выбора БЯМ. Содержание главы решает задачи 1–5 Введения и используется в главе 3 при описании реализации и эксперимента, а в главе 4 — при построении модели угроз.</w:t>
+        <w:t>В главе изложены результаты проектной части работы: формальная двухуровневая схема структурированного представления сетевого события, метод трансляции пакетного трафика в промпт локальной языковой модели, архитектура программного решения и обоснование выбора БЯМ. Содержание главы решает задачи 1–5 Введения и используется в главе 3 при описании реализации и эксперимента, а в главе 4 — при построении модели угроз.</w:t>
       </w:r>
     </w:p>
     <w:p>
@@ -6788,7 +6726,7 @@
     </w:p>
     <w:p>
       <w:r>
-        <w:t>ФТ-2. Из входного файла извлекаются нормализованные поля per-packet и агрегированные характеристики per-flow по 5-tuple, образующие двухуровневое структурированное описание. Формальная схема описания приводится в подразделе 2.2 и составляет ядро научной новизны работы (задача 2 Введения).</w:t>
+        <w:t>ФТ-2. Из входного файла извлекаются нормализованные поля per-packet и агрегированные характеристики per-flow по 5-tuple, образующие двухуровневое структурированное описание. Формальная схема описания приведена в подразделе 2.2 и составляет ядро научной новизны работы (задача 2 Введения).</w:t>
       </w:r>
     </w:p>
     <w:p>
@@ -6803,7 +6741,7 @@
     </w:p>
     <w:p>
       <w:r>
-        <w:t>ФТ-5. Система предоставляет демонстрационный режим для трёх pcap, входящих в репозиторий: HTTP-сессия, NTP-аномалия, 5G NGAP-сигнализация. Сценарии раскрываются в главе 3 и обеспечивают воспроизводимую самопроверку — задача 5 Введения.</w:t>
+        <w:t>ФТ-5. Система предоставляет демонстрационный режим для трёх pcap, входящих в репозиторий: HTTP-сессия, NTP-аномалия, 5G NGAP-сигнализация. Сценарии раскрываются в главе 3 и обеспечивают воспроизводимую самопроверку (задача 5 Введения).</w:t>
       </w:r>
     </w:p>
     <w:p>
@@ -6828,7 +6766,7 @@
     </w:p>
     <w:p>
       <w:r>
-        <w:t>НФТ-4. Веб-интерфейс реализован на Streamlit и работает в современных браузерах через локальный порт 8501. Дополнительный сервер приложений не требуется.</w:t>
+        <w:t>НФТ-4. Веб-интерфейс реализован на Streamlit и работает в современных браузерах через локальный порт 8501. Дополнительный сервер приложений не нужен.</w:t>
       </w:r>
     </w:p>
     <w:p>
@@ -6838,12 +6776,12 @@
     </w:p>
     <w:p>
       <w:r>
-        <w:t>О-1. Размер контекстного окна модели — от 4 до 128 тыс. токенов в зависимости от выбранного варианта. Структурированное описание события в одном промпте не превышает 2048 токенов, что обеспечивает совместимость со всеми поддерживаемыми моделями; конкретные оценки приводятся в подразделе 2.2.</w:t>
-      </w:r>
-    </w:p>
-    <w:p>
-      <w:r>
-        <w:t>О-2. Объём оперативной памяти — от 8 до 16 ГБ при использовании квантованных весов GGUF. Для моделей крупнее 8 миллиардов параметров требуется отдельное обоснование, приводимое в подразделе 2.5.</w:t>
+        <w:t>О-1. Размер контекстного окна модели — от 4 до 128 тыс. токенов в зависимости от выбранного варианта. Структурированное описание события в одном промпте не превышает 2048 токенов, что обеспечивает совместимость со всеми поддерживаемыми моделями; конкретные оценки приведены в подразделе 2.2.</w:t>
+      </w:r>
+    </w:p>
+    <w:p>
+      <w:r>
+        <w:t>О-2. Объём оперативной памяти — от 8 до 16 ГБ при использовании квантованных весов GGUF. Для моделей крупнее 8 миллиардов параметров требуется отдельное обоснование, приведённое в подразделе 2.5.</w:t>
       </w:r>
     </w:p>
     <w:p>
@@ -6853,7 +6791,7 @@
     </w:p>
     <w:p>
       <w:r>
-        <w:t>Полученный набор требований является опорой для двух последующих подразделов: подразделе 2.4 проверяет, что архитектура реализует ФТ-1...5 без нарушения НФТ-1...4 и О-1...3, а подразделе 2.5 фиксирует выбор модели в рамках НФТ-3 и О-2.</w:t>
+        <w:t>Сформированный набор требований служит опорой для двух последующих подразделов: подраздел 2.4 проверяет, что архитектура реализует ФТ-1...5 без нарушения НФТ-1...4 и О-1...3, а подраздел 2.5 фиксирует выбор модели в рамках НФТ-3 и О-2.</w:t>
       </w:r>
     </w:p>
     <w:p>
@@ -6873,7 +6811,7 @@
     </w:p>
     <w:p>
       <w:r>
-        <w:t>Схема записана в нотации JSON Schema Draft 2020-12 [4] и оформлена как объект NetworkEvent с двумя обязательными полями: packet (Уровень 1) и flow (Уровень 2). JSON выбран как транспортный формат: его синтаксис стандартизован RFC 8259 [10], парсеры доступны в любой среде, и ровно его модели семейств Llama [16] и Mistral [17] обрабатывают в режиме структурированного вывода без дополнительной настройки.</w:t>
+        <w:t>Схема записана в нотации JSON Schema Draft 2020-12 [4] и оформлена как объект NetworkEvent с двумя обязательными полями: packet (Уровень 1) и flow (Уровень 2). JSON выбран как транспортный формат: его синтаксис стандартизован RFC 8259 [10], парсеры доступны в любой среде, и именно его модели семейств Llama [16] и Mistral [17] обрабатывают в режиме структурированного вывода без дополнительной настройки.</w:t>
       </w:r>
     </w:p>
     <w:p>
@@ -6904,7 +6842,7 @@
                     </pic:cNvPicPr>
                   </pic:nvPicPr>
                   <pic:blipFill>
-                    <a:blip r:embed="rId8"/>
+                    <a:blip r:embed="rId13"/>
                     <a:stretch>
                       <a:fillRect/>
                     </a:stretch>
@@ -9431,22 +9369,22 @@
     </w:tbl>
     <w:p>
       <w:r>
-        <w:t>Граница объёма передаваемого представления оценивается следующим образом. Сериализация одного NetworkEvent с заполненными полями обоих уровней даёт JSON-объект около 1,2–1,8 кБ, что после токенизации Llama-3 даёт 380–520 токенов. Вместе с системной преамбулой и шаблоном промпта (раздел 2.3) полный запрос укладывается в 1,8–2,0 тыс. токенов, поэтому работают все модели с контекстом от 4 тыс. токенов — а это все рассматриваемые в работе модели [12; 18; 23; 33].</w:t>
-      </w:r>
-    </w:p>
-    <w:p>
-      <w:r>
-        <w:t>JSON Schema выполняет в системе функцию формального контракта. Формальное описание структуры (Listing 1) выполняет три задачи. Прежде всего, оно является источником истины для модуля Schema Translator (см. подраздел 2.4), который обязан выдавать только валидные относительно схемы объекты. Далее, схема вписывается в системный промпт в виде краткого description каждого поля, чтобы модель знала, что от неё ожидается. Наконец, она делает результат метода переносимым: любой потребитель, поддерживающий JSON Schema 2020-12, валидирует поток событий без знакомства с кодовой базой. Полный текст схемы вынесен в Приложение А, в основном тексте приводится только её структурный остов.</w:t>
-      </w:r>
-    </w:p>
-    <w:p>
-      <w:r>
-        <w:t>Связь со схемой признаков существующих исследований проявляется следующим образом. Подмножество выбранных полей пересекается с признаковым пространством CICFlowMeter [1], что обеспечивает совместимость с уже размеченными датасетами UNSW-NB15 [2] и CICIDS2017 [3] и даёт возможность сравнивать гибридный метод с классическими ML-классификаторами на одной и той же признаковой базе (что и реализовано в главе 3). Отличие — в добавлении прикладного уровня (app_layer, app_summary), которое CICFlowMeter не делает; именно этот добавочный канал даёт модели возможность объяснять решение со ссылкой на содержимое сессии, а не только на её статистический профиль.</w:t>
-      </w:r>
-    </w:p>
-    <w:p>
-      <w:r>
-        <w:t>Таким образом, формальная двухуровневая схема даёт системе контракт между модулями захвата, трансляции и инференса, а исследованию — точку отсчёта для воспроизведения и сравнения с классическими ML-методами. На этом контракте строится метод трансляции pcap в JSON, затем формируется промпт, описываемый в подразделе 2.3.</w:t>
+        <w:t>Граница объёма передаваемого представления оценивается так. Сериализация одного NetworkEvent с заполненными полями обоих уровней даёт JSON-объект около 1,2–1,8 кБ, что после токенизации Llama-3 даёт 380–520 токенов. Вместе с системной преамбулой и шаблоном промпта (раздел 2.3) полный запрос укладывается в 1,8–2,0 тыс. токенов, поэтому работают все модели с контекстом от 4 тыс. токенов — а это все рассматриваемые в работе модели [12; 18; 23; 33].</w:t>
+      </w:r>
+    </w:p>
+    <w:p>
+      <w:r>
+        <w:t>JSON Schema выполняет в системе функцию формального контракта. Формальное описание структуры (Listing 1) решает три задачи. Прежде всего, оно служит источником истины для модуля Schema Translator (см. подраздел 2.4), который обязан выдавать только валидные относительно схемы объекты. Далее, схема вписывается в системный промпт в виде краткого description каждого поля, чтобы модель знала, что от неё ожидается. Наконец, она делает результат метода переносимым: любой потребитель, поддерживающий JSON Schema 2020-12, валидирует поток событий без знакомства с кодовой базой. Полный текст схемы вынесен в Приложение А, в основном тексте приведён только её структурный остов.</w:t>
+      </w:r>
+    </w:p>
+    <w:p>
+      <w:r>
+        <w:t>Связь со схемой признаков существующих исследований проявляется так. Подмножество выбранных полей пересекается с признаковым пространством CICFlowMeter [1], что обеспечивает совместимость с уже размеченными датасетами UNSW-NB15 [2] и CICIDS2017 [3] и даёт возможность сравнивать гибридный метод с классическими ML-классификаторами на одной и той же признаковой базе (что и реализовано в главе 3). Отличие — в добавлении прикладного уровня (app_layer, app_summary), которого CICFlowMeter не делает; именно этот добавочный канал даёт модели возможность объяснять решение со ссылкой на содержимое сессии, а не только на её статистический профиль.</w:t>
+      </w:r>
+    </w:p>
+    <w:p>
+      <w:r>
+        <w:t>Таким образом, формальная двухуровневая схема даёт системе контракт между модулями захвата, трансляции и инференса, а исследованию — точку отсчёта для воспроизведения и сравнения с классическими ML-методами. На этом контракте строится метод трансляции pcap в JSON, после чего формируется промпт, описываемый в подразделе 2.3.</w:t>
       </w:r>
     </w:p>
     <w:p>
@@ -9736,7 +9674,7 @@
     </w:p>
     <w:p>
       <w:r>
-        <w:t>Шаги 1–3 представлены в Листинге 1 как программный псевдокод. Реализация на Python соответствует ему почти строка в строку, что упрощает воспроизведение метода независимыми разработчиками. Каждый блок алгоритма вынесен в отдельный модуль (lpw_packet, lpw_flow, lpw_prompt, lpw_llm); зависимости однонаправлены — верхние слои не знают о деталях нижних. Замена БЯМ-клиента или формата захвата выполняется без правки модулей нормализации. Каркас унаследован из существующей кодовой базы; детали реализации описаны в главе 3.</w:t>
+        <w:t>Шаги 1–3 представлены в Листинге 1 как программный псевдокод. Реализация на Python соответствует ему почти строка в строку, что упрощает воспроизведение метода независимыми разработчиками. Каждый блок алгоритма вынесен в отдельный модуль (ta_packet, ta_flow, ta_prompt, ta_llm); зависимости однонаправлены — верхние слои не знают о деталях нижних. Замена БЯМ-клиента или формата захвата выполняется без правки модулей нормализации. Каркас унаследован из существующей кодовой базы; детали реализации описаны в главе 3.</w:t>
       </w:r>
     </w:p>
     <w:p>
@@ -9762,7 +9700,7 @@
                     </pic:cNvPicPr>
                   </pic:nvPicPr>
                   <pic:blipFill>
-                    <a:blip r:embed="rId9"/>
+                    <a:blip r:embed="rId14"/>
                     <a:stretch>
                       <a:fillRect/>
                     </a:stretch>
@@ -9831,7 +9769,7 @@
                     </pic:cNvPicPr>
                   </pic:nvPicPr>
                   <pic:blipFill>
-                    <a:blip r:embed="rId10"/>
+                    <a:blip r:embed="rId15"/>
                     <a:stretch>
                       <a:fillRect/>
                     </a:stretch>
@@ -9869,7 +9807,7 @@
     </w:p>
     <w:p>
       <w:r>
-        <w:t>Компонентная декомпозиция. Решение разделено на три слоя: UI Layer, Core и внешние компоненты (Рисунок 5). Принцип разделения — направленные зависимости: UI знает о Core, Core знает о внешних компонентах, обратные ссылки запрещены. Такое расслоение позволяет заменять любой нижний слой (например, переходить с Ollama на vllm-server) без правки верхних, и оно же делает возможным юнит-тестирование Core без поднятия Streamlit-приложения.</w:t>
+        <w:t>Компонентная декомпозиция. Решение разделено на три слоя: UI Layer, Core и внешние компоненты (Рисунок 5). Принцип разделения — направленные зависимости: UI знает о Core, Core знает о внешних компонентах, обратные ссылки запрещены. Такое расслоение даёт возможность заменять любой нижний слой (например, переходить с Ollama на vllm-server) без правки верхних, и оно же делает возможным юнит-тестирование Core без поднятия Streamlit-приложения.</w:t>
       </w:r>
     </w:p>
     <w:p>
@@ -9895,7 +9833,7 @@
                     </pic:cNvPicPr>
                   </pic:nvPicPr>
                   <pic:blipFill>
-                    <a:blip r:embed="rId11"/>
+                    <a:blip r:embed="rId16"/>
                     <a:stretch>
                       <a:fillRect/>
                     </a:stretch>
@@ -9928,7 +9866,7 @@
     </w:p>
     <w:p>
       <w:r>
-        <w:t>Capture Loader (lpw_packet.py) — обёртка над PyShark [6] и tshark, отвечающая за разбор pcap на пакеты и извлечение полей Уровня 1. Доработка: добавляется явная нормализация имён полей в формат, ожидаемый Schema Translator. Существующая реализация возвращает «как есть» названия из tshark (с точками и неочевидными суффиксами), что неудобно для последующих модулей; нормализация приводит имена к snake_case и одновременно фильтрует поля, не входящие в схему v1, чтобы не передавать в Schema Translator лишний шум.</w:t>
+        <w:t>Capture Loader (ta_packet.py) — обёртка над PyShark [6] и tshark, отвечающая за разбор pcap на пакеты и извлечение полей Уровня 1. Доработка: добавляется явная нормализация имён полей в формат, ожидаемый Schema Translator. Существующая реализация возвращает «как есть» названия из tshark (с точками и неочевидными суффиксами), что неудобно для последующих модулей; нормализация приводит имена к snake_case и одновременно фильтрует поля, не входящие в схему v1, чтобы не передавать в Schema Translator лишний шум.</w:t>
       </w:r>
     </w:p>
     <w:p>
@@ -9938,12 +9876,12 @@
     </w:p>
     <w:p>
       <w:r>
-        <w:t>LLM Gateway (lpw_ollamaClient.py) — HTTP-клиент к Ollama API [14]. Доработка: добавляется поддержка response_format=JSON и сборка промпта по шаблону Рисунка 3. Шлюз держит единственное соединение keep-alive за один сеанс анализа, чтобы не платить за TLS- и TCP-handshake на каждом событии; для loopback-обращений выгода от keep-alive небольшая, но для будущего варианта с Ollama на отдельной машине в сегменте лаборатории такой задел уже заложен.</w:t>
-      </w:r>
-    </w:p>
-    <w:p>
-      <w:r>
-        <w:t>Reasoning Agent (lpw_agent.py + 5g_agent.yaml) — опциональный модуль на основе CrewAI, специализированный на сценариях с богатой прикладной семантикой (например, NGAP-сигнализация в 5G). В базовой комплектации не используется; включается на демонстрационных кейсах в главе 3. Подключение агента не нарушает базовый поток обработки: если агент не активирован, LLM Gateway работает напрямую, а сам поток данных остаётся таким, как нарисован на Рисунке 6.</w:t>
+        <w:t>LLM Gateway (ta_ollamaClient.py) — HTTP-клиент к Ollama API [14]. Доработка: добавляется поддержка response_format=JSON и сборка промпта по шаблону Рисунка 3. Шлюз держит единственное соединение keep-alive за один сеанс анализа, чтобы не платить за TLS- и TCP-handshake на каждом событии; для loopback-обращений выгода от keep-alive небольшая, но для будущего варианта с Ollama на отдельной машине в сегменте лаборатории такой задел уже заложен.</w:t>
+      </w:r>
+    </w:p>
+    <w:p>
+      <w:r>
+        <w:t>Reasoning Agent (ta_agent.py + 5g_agent.yaml) — опциональный модуль на основе CrewAI [28], специализированный на сценариях с богатой прикладной семантикой (например, NGAP-сигнализация в 5G). В базовой комплектации не используется; включается на демонстрационных кейсах в главе 3. Подключение агента не нарушает базовый поток обработки: если агент не активирован, LLM Gateway работает напрямую, а сам поток данных остаётся таким, как нарисован на Рисунке 6.</w:t>
       </w:r>
     </w:p>
     <w:p>
@@ -9969,7 +9907,7 @@
                     </pic:cNvPicPr>
                   </pic:nvPicPr>
                   <pic:blipFill>
-                    <a:blip r:embed="rId12"/>
+                    <a:blip r:embed="rId17"/>
                     <a:stretch>
                       <a:fillRect/>
                     </a:stretch>
@@ -10052,7 +9990,7 @@
     </w:p>
     <w:p>
       <w:r>
-        <w:t>Выбор основной языковой модели подчинён четырём критериям, вытекающим из требований подраздела 2.1: локальный запуск при 8–16 ГБ оперативной памяти (О-2), размер контекстного окна не меньше 4 тыс. токенов (О-1), допустимая лицензия с возможностью использования в академической работе (О-3) и зрелая поддержка в Ollama [14], которая выбрана как унифицированный шлюз. Таблица 2 сводит шесть рассматриваемых моделей по этим критериям.</w:t>
+        <w:t>Выбор основной языковой модели подчинён четырём критериям, вытекающим из требований подраздела 2.1: локальный запуск при 8–16 ГБ оперативной памяти (О-2), размер контекстного окна не меньше 4 тыс. токенов (О-1), допустимая лицензия с возможностью использования в академической работе (О-3) и зрелая поддержка в Ollama [14], выбранной как унифицированный шлюз. Таблица 2 сводит шесть рассматриваемых моделей по этим критериям.</w:t>
       </w:r>
     </w:p>
     <w:p>
@@ -11224,16 +11162,29 @@
       </w:r>
     </w:p>
     <w:p>
+      <w:r>
+        <w:t>На программном уровне выбор активной локальной модели реализован в разделе Configuration Studio → LLM Server, где задаются адрес и порт Ollama-сервера и выбирается одна из доступных моделей (Рисунок 7).</w:t>
+      </w:r>
+    </w:p>
+    <w:p>
       <w:pPr>
         <w:ind w:firstLine="0"/>
         <w:jc w:val="center"/>
+        <w:rPr>
+          <w:rFonts w:hint="default"/>
+          <w:lang w:val="en-US"/>
+        </w:rPr>
       </w:pPr>
       <w:r>
+        <w:rPr>
+          <w:rFonts w:hint="default"/>
+          <w:lang w:val="en-US"/>
+        </w:rPr>
         <w:drawing>
           <wp:inline distT="0" distB="0" distL="114300" distR="114300">
-            <wp:extent cx="2649220" cy="3973830"/>
-            <wp:effectExtent l="0" t="0" r="15875" b="23495"/>
-            <wp:docPr id="106" name="Picture 106"/>
+            <wp:extent cx="6108065" cy="1956435"/>
+            <wp:effectExtent l="0" t="0" r="13335" b="24765"/>
+            <wp:docPr id="2" name="Picture 2" descr="photo_4_2026-05-02_02-33-49"/>
             <wp:cNvGraphicFramePr>
               <a:graphicFrameLocks xmlns:a="http://schemas.openxmlformats.org/drawingml/2006/main" noChangeAspect="1"/>
             </wp:cNvGraphicFramePr>
@@ -11241,13 +11192,13 @@
               <a:graphicData uri="http://schemas.openxmlformats.org/drawingml/2006/picture">
                 <pic:pic xmlns:pic="http://schemas.openxmlformats.org/drawingml/2006/picture">
                   <pic:nvPicPr>
-                    <pic:cNvPr id="106" name="Picture 106"/>
+                    <pic:cNvPr id="2" name="Picture 2" descr="photo_4_2026-05-02_02-33-49"/>
                     <pic:cNvPicPr>
                       <a:picLocks noChangeAspect="1"/>
                     </pic:cNvPicPr>
                   </pic:nvPicPr>
                   <pic:blipFill>
-                    <a:blip r:embed="rId13"/>
+                    <a:blip r:embed="rId18"/>
                     <a:stretch>
                       <a:fillRect/>
                     </a:stretch>
@@ -11255,7 +11206,7 @@
                   <pic:spPr>
                     <a:xfrm>
                       <a:off x="0" y="0"/>
-                      <a:ext cx="2649600" cy="3974400"/>
+                      <a:ext cx="6108065" cy="1956435"/>
                     </a:xfrm>
                     <a:prstGeom prst="rect">
                       <a:avLst/>
@@ -11280,7 +11231,7 @@
           <w:sz w:val="28"/>
           <w:szCs w:val="28"/>
         </w:rPr>
-        <w:t>Рисунок 7 — Выбор локальной языковой модели в интерфейсе LPW</w:t>
+        <w:t>Рисунок 7 — Выбор локальной языковой модели в интерфейсе TA</w:t>
       </w:r>
     </w:p>
     <w:p>
@@ -11305,7 +11256,7 @@
     </w:p>
     <w:p>
       <w:r>
-        <w:t>Разработана и описана в нотации JSON Schema 2020-12 [4] двухуровневая схема представления сетевого события: десять полей пакетного уровня и шестнадцать признаков потока, агрегированных по 5-tuple на окне 120 с. Подмножество выбрано на пересечении классических наборов NSL-KDD/UNSW-NB15 [2], CICFlowMeter [1] и потребностей объяснимости. Полная схема с типами, семантикой и примерами сведена в Таблице 1; внешний вид схемы проиллюстрирован Рисунком 9.</w:t>
+        <w:t>Разработана и описана в нотации JSON Schema 2020-12 [4] двухуровневая схема представления сетевого события: десять полей пакетного уровня и шестнадцать признаков потока, агрегированных по 5-tuple на окне 120 с. Подмножество выбрано на пересечении классических наборов NSL-KDD/UNSW-NB15 [2], CICFlowMeter [1] и потребностей объяснимости. Полная схема с типами, семантикой и примерами сведена в Таблице 1; внешний вид схемы проиллюстрирован Рисунком 12.</w:t>
       </w:r>
     </w:p>
     <w:p>
@@ -11340,7 +11291,7 @@
     </w:p>
     <w:p>
       <w:r>
-        <w:t>В главе описана программная реализация LLM-анализатора трафика, методика её экспериментальной проверки на UNSW-NB15, прогон гибридного метода на реальных pcap-кейсах и сравнение с базовыми ML-методами. Содержание соответствует задачам 2 и 3 Введения и опирается на проектные решения Главы 2.</w:t>
+        <w:t>В главе описана программная реализация LLM-анализатора трафика, методика её экспериментальной проверки на UNSW-NB15, прогон гибридного метода на реальных pcap-кейсах и сравнение с базовыми ML-методами. Содержание соответствует задачам 2 и 3 Введения и опирается на проектные решения главы 2.</w:t>
       </w:r>
     </w:p>
     <w:p>
@@ -11355,7 +11306,7 @@
     </w:p>
     <w:p>
       <w:r>
-        <w:t>Local Packet Whisperer (LPW) реализован на Python 3.13 в соответствии с архитектурой подраздела 2.4. В подразделе последовательно описаны компоненты: загрузчик трафика, транслятор схемы, шлюз к языковой модели, веб-интерфейс, агентный модуль и стек зависимостей.</w:t>
+        <w:t>Traffic analyzer (TA) реализован на Python 3.13 в соответствии с архитектурой подраздела 2.4. В подразделе последовательно описаны компоненты: загрузчик трафика, транслятор схемы, шлюз к языковой модели, веб-интерфейс, агентный модуль и стек зависимостей. Главное окно интерфейса показано на Рисунке 8.</w:t>
       </w:r>
     </w:p>
     <w:p>
@@ -11382,7 +11333,7 @@
                     </pic:cNvPicPr>
                   </pic:nvPicPr>
                   <pic:blipFill>
-                    <a:blip r:embed="rId14"/>
+                    <a:blip r:embed="rId19"/>
                     <a:stretch>
                       <a:fillRect/>
                     </a:stretch>
@@ -11415,7 +11366,178 @@
           <w:sz w:val="28"/>
           <w:szCs w:val="28"/>
         </w:rPr>
-        <w:t>Рисунок 8 — Главное окно интерфейса Local Packet Whisperer</w:t>
+        <w:t>Рисунок 8 — Главное окно интерфейса Traffic analyzer</w:t>
+      </w:r>
+    </w:p>
+    <w:p>
+      <w:r>
+        <w:t>После загрузки PCAP-файла модуль выводит информационную панель сессии: выбранную локальную модель, состояние LLM-подключения, активный режим стриминга и индикатор активного захвата (Рисунок 9).</w:t>
+      </w:r>
+    </w:p>
+    <w:p>
+      <w:pPr>
+        <w:jc w:val="center"/>
+      </w:pPr>
+      <w:r>
+        <w:drawing>
+          <wp:inline distT="0" distB="0" distL="114300" distR="114300">
+            <wp:extent cx="5760720" cy="2546985"/>
+            <wp:effectExtent l="0" t="0" r="5080" b="18415"/>
+            <wp:docPr id="112" name="Picture 112"/>
+            <wp:cNvGraphicFramePr>
+              <a:graphicFrameLocks xmlns:a="http://schemas.openxmlformats.org/drawingml/2006/main" noChangeAspect="1"/>
+            </wp:cNvGraphicFramePr>
+            <a:graphic xmlns:a="http://schemas.openxmlformats.org/drawingml/2006/main">
+              <a:graphicData uri="http://schemas.openxmlformats.org/drawingml/2006/picture">
+                <pic:pic xmlns:pic="http://schemas.openxmlformats.org/drawingml/2006/picture">
+                  <pic:nvPicPr>
+                    <pic:cNvPr id="112" name="Picture 112"/>
+                    <pic:cNvPicPr>
+                      <a:picLocks noChangeAspect="1"/>
+                    </pic:cNvPicPr>
+                  </pic:nvPicPr>
+                  <pic:blipFill>
+                    <a:blip r:embed="rId20"/>
+                    <a:stretch>
+                      <a:fillRect/>
+                    </a:stretch>
+                  </pic:blipFill>
+                  <pic:spPr>
+                    <a:xfrm>
+                      <a:off x="0" y="0"/>
+                      <a:ext cx="5760720" cy="2547318"/>
+                    </a:xfrm>
+                    <a:prstGeom prst="rect">
+                      <a:avLst/>
+                    </a:prstGeom>
+                  </pic:spPr>
+                </pic:pic>
+              </a:graphicData>
+            </a:graphic>
+          </wp:inline>
+        </w:drawing>
+      </w:r>
+    </w:p>
+    <w:p>
+      <w:pPr>
+        <w:pStyle w:val="16"/>
+      </w:pPr>
+      <w:r>
+        <w:t>Рисунок 9 — Информационная панель сессии в интерфейсе Traffic analyzer</w:t>
+      </w:r>
+    </w:p>
+    <w:p>
+      <w:r>
+        <w:t>Конфигурация модуля выполняется в отдельном разделе Configuration Studio. Вкладка General задаёт общие параметры взаимодействия с моделью: системный промпт и режим стриминга ответов (Рисунок 10).</w:t>
+      </w:r>
+    </w:p>
+    <w:p>
+      <w:pPr>
+        <w:jc w:val="center"/>
+      </w:pPr>
+      <w:r>
+        <w:drawing>
+          <wp:inline distT="0" distB="0" distL="114300" distR="114300">
+            <wp:extent cx="5760720" cy="1768475"/>
+            <wp:effectExtent l="0" t="0" r="5080" b="9525"/>
+            <wp:docPr id="113" name="Picture 113"/>
+            <wp:cNvGraphicFramePr>
+              <a:graphicFrameLocks xmlns:a="http://schemas.openxmlformats.org/drawingml/2006/main" noChangeAspect="1"/>
+            </wp:cNvGraphicFramePr>
+            <a:graphic xmlns:a="http://schemas.openxmlformats.org/drawingml/2006/main">
+              <a:graphicData uri="http://schemas.openxmlformats.org/drawingml/2006/picture">
+                <pic:pic xmlns:pic="http://schemas.openxmlformats.org/drawingml/2006/picture">
+                  <pic:nvPicPr>
+                    <pic:cNvPr id="113" name="Picture 113"/>
+                    <pic:cNvPicPr>
+                      <a:picLocks noChangeAspect="1"/>
+                    </pic:cNvPicPr>
+                  </pic:nvPicPr>
+                  <pic:blipFill>
+                    <a:blip r:embed="rId21"/>
+                    <a:stretch>
+                      <a:fillRect/>
+                    </a:stretch>
+                  </pic:blipFill>
+                  <pic:spPr>
+                    <a:xfrm>
+                      <a:off x="0" y="0"/>
+                      <a:ext cx="5760720" cy="1768721"/>
+                    </a:xfrm>
+                    <a:prstGeom prst="rect">
+                      <a:avLst/>
+                    </a:prstGeom>
+                  </pic:spPr>
+                </pic:pic>
+              </a:graphicData>
+            </a:graphic>
+          </wp:inline>
+        </w:drawing>
+      </w:r>
+    </w:p>
+    <w:p>
+      <w:pPr>
+        <w:pStyle w:val="16"/>
+      </w:pPr>
+      <w:r>
+        <w:t>Рисунок 10 — Общие настройки модуля Configuration Studio</w:t>
+      </w:r>
+    </w:p>
+    <w:p>
+      <w:r>
+        <w:t>Вкладка Protocols задаёт перечень декодируемых сетевых протоколов и ограничивает область разбора захвата выбранным набором (Рисунок 11).</w:t>
+      </w:r>
+    </w:p>
+    <w:p>
+      <w:pPr>
+        <w:jc w:val="center"/>
+      </w:pPr>
+      <w:r>
+        <w:drawing>
+          <wp:inline distT="0" distB="0" distL="114300" distR="114300">
+            <wp:extent cx="5760720" cy="1574800"/>
+            <wp:effectExtent l="0" t="0" r="5080" b="0"/>
+            <wp:docPr id="114" name="Picture 114"/>
+            <wp:cNvGraphicFramePr>
+              <a:graphicFrameLocks xmlns:a="http://schemas.openxmlformats.org/drawingml/2006/main" noChangeAspect="1"/>
+            </wp:cNvGraphicFramePr>
+            <a:graphic xmlns:a="http://schemas.openxmlformats.org/drawingml/2006/main">
+              <a:graphicData uri="http://schemas.openxmlformats.org/drawingml/2006/picture">
+                <pic:pic xmlns:pic="http://schemas.openxmlformats.org/drawingml/2006/picture">
+                  <pic:nvPicPr>
+                    <pic:cNvPr id="114" name="Picture 114"/>
+                    <pic:cNvPicPr>
+                      <a:picLocks noChangeAspect="1"/>
+                    </pic:cNvPicPr>
+                  </pic:nvPicPr>
+                  <pic:blipFill>
+                    <a:blip r:embed="rId22"/>
+                    <a:stretch>
+                      <a:fillRect/>
+                    </a:stretch>
+                  </pic:blipFill>
+                  <pic:spPr>
+                    <a:xfrm>
+                      <a:off x="0" y="0"/>
+                      <a:ext cx="5760720" cy="1575197"/>
+                    </a:xfrm>
+                    <a:prstGeom prst="rect">
+                      <a:avLst/>
+                    </a:prstGeom>
+                  </pic:spPr>
+                </pic:pic>
+              </a:graphicData>
+            </a:graphic>
+          </wp:inline>
+        </w:drawing>
+      </w:r>
+    </w:p>
+    <w:p>
+      <w:pPr>
+        <w:pStyle w:val="16"/>
+      </w:pPr>
+      <w:r>
+        <w:t>Рисунок 11 — Настройка фильтров протоколов в модуле Configuration Studio</w:t>
       </w:r>
     </w:p>
     <w:p>
@@ -11430,7 +11552,7 @@
     </w:p>
     <w:p>
       <w:r>
-        <w:t>Schema Translator — единственный полностью новый модуль LPW, разработанный в работе. Он реализует отображение T из подраздела 2.3: список нормализованных пакетов превращается в объект NetworkEvent, валидируемый против JSON Schema 2020-12 (Приложение А.2). Структура схемы показана на Рисунке 9.</w:t>
+        <w:t>Schema Translator — единственный полностью новый модуль TA, разработанный в работе. Он реализует отображение T из подраздела 2.3: список нормализованных пакетов превращается в объект NetworkEvent, валидируемый против JSON Schema 2020-12 (Приложение А.2). Структура схемы показана на Рисунке 12.</w:t>
       </w:r>
     </w:p>
     <w:p>
@@ -11456,7 +11578,7 @@
                     </pic:cNvPicPr>
                   </pic:nvPicPr>
                   <pic:blipFill>
-                    <a:blip r:embed="rId15"/>
+                    <a:blip r:embed="rId23"/>
                     <a:stretch>
                       <a:fillRect/>
                     </a:stretch>
@@ -11484,7 +11606,7 @@
         <w:jc w:val="center"/>
       </w:pPr>
       <w:r>
-        <w:t>Рисунок 9 — Структура JSON Schema NetworkEvent</w:t>
+        <w:t>Рисунок 12 — Структура JSON Schema NetworkEvent</w:t>
       </w:r>
     </w:p>
     <w:p>
@@ -11494,7 +11616,7 @@
     </w:p>
     <w:p>
       <w:r>
-        <w:t>Последовательность работы — на Рисунке 10. После агрегации модуль валидирует объект через jsonschema против schema_v1.json (Приложение А.3); при нарушении схемы обработка останавливается с диагностическим сообщением (политика P3 из подраздела 4.6). Затем применяется политика P10 — сериализация с лимитом 2048 байт через serialize_for_prompt, при необходимости укорачивающий app_summary.</w:t>
+        <w:t>Последовательность работы — на Рисунке 13. После агрегации модуль валидирует объект через jsonschema против schema_v1.json (Приложение А.3); при нарушении схемы обработка останавливается с диагностическим сообщением (политика P3 из подраздела 4.6). Затем применяется политика P10 — сериализация с лимитом 2048 байт через serialize_for_prompt, при необходимости укорачивающая app_summary.</w:t>
       </w:r>
     </w:p>
     <w:p>
@@ -11520,7 +11642,7 @@
                     </pic:cNvPicPr>
                   </pic:nvPicPr>
                   <pic:blipFill>
-                    <a:blip r:embed="rId16"/>
+                    <a:blip r:embed="rId24"/>
                     <a:stretch>
                       <a:fillRect/>
                     </a:stretch>
@@ -11548,12 +11670,12 @@
         <w:jc w:val="center"/>
       </w:pPr>
       <w:r>
-        <w:t>Рисунок 10 — Sequence-диаграмма работы Schema Translator</w:t>
-      </w:r>
-    </w:p>
-    <w:p>
-      <w:r>
-        <w:t>Модуль занимает около 280 строк и покрыт 19 тестами: нормализация полей, агрегация по 5-tuple, валидация схемы и сериализация для промпта. На тестовом split UNSW-NB15 (175 341 запись) Schema Translator обработал все события без отказов; ~12% получили метку parse_state = "partial" — это записи без полей прикладного уровня в исходном CSV.</w:t>
+        <w:t>Рисунок 13 — Sequence-диаграмма работы Schema Translator</w:t>
+      </w:r>
+    </w:p>
+    <w:p>
+      <w:r>
+        <w:t>Модуль занимает около 280 строк и покрыт 19 тестами: нормализация полей, агрегация по 5-tuple, валидация схемы и сериализация для промпта. На тестовом split UNSW-NB15 (175 341 запись) Schema Translator обработал все события без отказов; ~12% получили метку parse_state = «partial» — это записи без полей прикладного уровня в исходном CSV.</w:t>
       </w:r>
     </w:p>
     <w:p>
@@ -11568,7 +11690,7 @@
     </w:p>
     <w:p>
       <w:r>
-        <w:t>LLM Gateway (lpw_ollamaClient.py) предоставляет два режима. Метод chat сохраняет историю и работает в интерактивном чате UI. Метод analyze_event — основной для гибридного метода: он принимает сериализованный NetworkEvent, формирует промпт по шаблону подраздела 2.3 и обращается к локальному серверу Ollama [14] версии 0.21.2 на порту 11434.</w:t>
+        <w:t>LLM Gateway (ta_ollamaClient.py) предоставляет два режима. Метод chat сохраняет историю и работает в интерактивном чате UI. Метод analyze_event — основной для гибридного метода: он принимает сериализованный NetworkEvent, формирует промпт по шаблону подраздела 2.3 и обращается к локальному серверу Ollama [14] версии 0.21.2 на порту 11434.</w:t>
       </w:r>
     </w:p>
     <w:p>
@@ -11599,7 +11721,7 @@
                     </pic:cNvPicPr>
                   </pic:nvPicPr>
                   <pic:blipFill>
-                    <a:blip r:embed="rId17"/>
+                    <a:blip r:embed="rId25"/>
                     <a:stretch>
                       <a:fillRect/>
                     </a:stretch>
@@ -11627,7 +11749,7 @@
         <w:jc w:val="center"/>
       </w:pPr>
       <w:r>
-        <w:t>Рисунок 11 — Sequence-диаграмма работы LLM Gateway</w:t>
+        <w:t>Рисунок 14 — Sequence-диаграмма работы LLM Gateway</w:t>
       </w:r>
     </w:p>
     <w:p>
@@ -11657,7 +11779,7 @@
         <w:jc w:val="left"/>
       </w:pPr>
       <w:r>
-        <w:t>Таблица 3 — Технологический стек системы LPW</w:t>
+        <w:t>Таблица 3 — Технологический стек системы TA</w:t>
       </w:r>
     </w:p>
     <w:tbl>
@@ -13035,7 +13157,7 @@
     </w:tbl>
     <w:p>
       <w:r>
-        <w:t>Зависимости фиксированы через requirements.txt с == для критичных компонентов. Скриншот pip freeze для ключевых пакетов — Рисунок 12; полный текст (260 пакетов с транзитивными зависимостями) — Приложение А.5. Развёртывание в три шага: создание venv, pip install -r requirements.txt (~3–4 минуты на MacBook M1), запуск streamlit run bin/lpw_home.py. Дополнительно нужны заранее установленный Ollama [14] и загруженная модель (по умолчанию phi3:mini, 2,3 ГБ).</w:t>
+        <w:t>Зависимости фиксированы через requirements.txt с == для критичных компонентов. Скриншот pip freeze для ключевых пакетов — Рисунок 15; полный текст (260 пакетов с транзитивными зависимостями) — Приложение А.5. Развёртывание в три шага: создание venv, pip install -r requirements.txt (~3–4 минуты на MacBook M1), запуск streamlit run bin/ta_home.py. Дополнительно нужны заранее установленный Ollama [14] и загруженная модель (по умолчанию phi3:mini, 2,3 ГБ).</w:t>
       </w:r>
     </w:p>
     <w:p>
@@ -13061,7 +13183,7 @@
                     </pic:cNvPicPr>
                   </pic:nvPicPr>
                   <pic:blipFill>
-                    <a:blip r:embed="rId18"/>
+                    <a:blip r:embed="rId26"/>
                     <a:stretch>
                       <a:fillRect/>
                     </a:stretch>
@@ -13089,7 +13211,7 @@
         <w:jc w:val="center"/>
       </w:pPr>
       <w:r>
-        <w:t>Рисунок 12 — Установленные зависимости (pip freeze)</w:t>
+        <w:t>Рисунок 15 — Установленные зависимости (pip freeze)</w:t>
       </w:r>
     </w:p>
     <w:p>
@@ -13149,7 +13271,7 @@
     </w:p>
     <w:p>
       <w:r>
-        <w:t>В качестве эталонных датасетов использованы UNSW-NB15 [2] и (опционально) CICIDS2017 [3]. Сравнительные характеристики — в Таблице 4.</w:t>
+        <w:t>Как эталонные датасеты использованы UNSW-NB15 [2] и (опционально) CICIDS2017 [3]. Сравнительные характеристики — в Таблице 4.</w:t>
       </w:r>
     </w:p>
     <w:p>
@@ -13871,16 +13993,7 @@
     </w:tbl>
     <w:p>
       <w:r>
-        <w:t>UNSW-NB15 загружен из публичного зеркала Hugging Face и используется в полном объёме для baseline-прогона. Выбор обусловлен современной таксономией классов атак (Generic, Exploits, Reconnaissance, DoS, Backdoor, Analysis, Fuzzers, Shellcode, Worms), лицензией CC-BY-NC-SA 4.0 (без email-регистрации) и пересечением признакового пространства с NetworkEvent (duration, total_packets_</w:t>
-      </w:r>
-      <w:r>
-        <w:rPr>
-          <w:i/>
-        </w:rPr>
-        <w:t>, total_bytes_</w:t>
-      </w:r>
-      <w:r>
-        <w:t>, tcp_window_avg).</w:t>
+        <w:t>UNSW-NB15 загружен из публичного зеркала Hugging Face и используется в полном объёме для baseline-прогона. Выбор обусловлен современной таксономией классов атак (Generic, Exploits, Reconnaissance, DoS, Backdoor, Analysis, Fuzzers, Shellcode, Worms), лицензией CC-BY-NC-SA 4.0 (без email-регистрации) и пересечением признакового пространства с NetworkEvent (duration, total_packets_, total_bytes_, tcp_window_avg).</w:t>
       </w:r>
     </w:p>
     <w:p>
@@ -14438,7 +14551,7 @@
     </w:p>
     <w:p>
       <w:r>
-        <w:t>В качестве baseline применены три классификатора из scikit-learn [8] версии 1.8.0: RandomForestClassifier (100 деревьев, Gini), LogisticRegression (L2-регуляризация) и MLPClassifier (два скрытых слоя 64 и 32 нейрона, ReLU, Adam). Все три обучены на одном признаковом пространстве — шесть полей уровня потока: duration, total_packets_fwd, total_packets_bwd, total_bytes_fwd, total_bytes_bwd, tcp_window_avg. Это пересечение признаков reduced-набора UNSW-NB15 и схемы NetworkEvent. Гибридный метод оперирует тем же набором — сравнение различает только способ получения предсказания, не объём информации.</w:t>
+        <w:t>Как baseline применены три классификатора из scikit-learn [8] версии 1.8.0: RandomForestClassifier (100 деревьев, Gini), LogisticRegression (L2-регуляризация) и MLPClassifier (два скрытых слоя 64 и 32 нейрона, ReLU, Adam). Все три обучены на одном признаковом пространстве — шесть полей уровня потока: duration, total_packets_fwd, total_packets_bwd, total_bytes_fwd, total_bytes_bwd, tcp_window_avg. Это пересечение признаков reduced-набора UNSW-NB15 и схемы NetworkEvent. Гибридный метод оперирует тем же набором — сравнение различает только способ получения предсказания, не объём информации.</w:t>
       </w:r>
     </w:p>
     <w:p>
@@ -14453,7 +14566,7 @@
     </w:p>
     <w:p>
       <w:r>
-        <w:t>Все эксперименты выполнены на Apple Silicon (Mac), 16 ГБ RAM, без GPU. Это сознательный выбор — показать применимость метода на ноутбуке аналитика без серверной инфраструктуры. Версии зависимостей зафиксированы в requirements.txt; состав окружения подтверждён прогоном pytest -v (Рисунок 13, 36 тестов из 36, 0,82 с). random_state = 42 фиксирует случайное состояние всех ML-операций.</w:t>
+        <w:t>Все эксперименты выполнены на Apple Silicon (Mac), 16 ГБ RAM, без GPU. Выбор сознательный — показать применимость метода на ноутбуке аналитика без серверной инфраструктуры. Версии зависимостей зафиксированы в requirements.txt; состав окружения подтверждён прогоном pytest -v (Рисунок 16, 36 тестов из 36, 0,82 с). random_state = 42 фиксирует случайное состояние всех ML-операций.</w:t>
       </w:r>
     </w:p>
     <w:p>
@@ -14479,7 +14592,7 @@
                     </pic:cNvPicPr>
                   </pic:nvPicPr>
                   <pic:blipFill>
-                    <a:blip r:embed="rId19"/>
+                    <a:blip r:embed="rId27"/>
                     <a:stretch>
                       <a:fillRect/>
                     </a:stretch>
@@ -14507,7 +14620,7 @@
         <w:jc w:val="center"/>
       </w:pPr>
       <w:r>
-        <w:t>Рисунок 13 — Прогон pytest в LPW (36 passed)</w:t>
+        <w:t>Рисунок 16 — Прогон pytest в TA (36 passed)</w:t>
       </w:r>
     </w:p>
     <w:p>
@@ -15327,7 +15440,7 @@
                     </pic:cNvPicPr>
                   </pic:nvPicPr>
                   <pic:blipFill>
-                    <a:blip r:embed="rId20"/>
+                    <a:blip r:embed="rId28"/>
                     <a:stretch>
                       <a:fillRect/>
                     </a:stretch>
@@ -15360,7 +15473,7 @@
           <w:sz w:val="28"/>
           <w:szCs w:val="28"/>
         </w:rPr>
-        <w:t>Рисунок 14 — PR-кривые базовых классификаторов на наборе UNSW-NB15</w:t>
+        <w:t>Рисунок 17 — PR-кривые базовых классификаторов на наборе UNSW-NB15</w:t>
       </w:r>
     </w:p>
     <w:p>
@@ -16074,7 +16187,7 @@
     </w:p>
     <w:p>
       <w:r>
-        <w:t>Гибридный метод классифицирует событие как «Exploits» с явным упоминанием sqlmap в reasoning и путём packet.app_summary в evidence. Кейс показывает, что метод корректно использует текстовое содержимое прикладного уровня. Базовые ML-классификаторы по шести числовым признакам (подраздел 3.2.4) на этот кейс по построению не реагируют — поле app_summary в их признаковом пространстве отсутствует. Это первое преимущество гибридного метода из подразделе 3.5: способность работать с тем фрагментом события, который остаётся за пределами привычного для ML числового вектора.</w:t>
+        <w:t>Гибридный метод классифицирует событие как «Exploits» с явным упоминанием sqlmap в reasoning и путём packet.app_summary в evidence. Кейс показывает, что метод корректно использует текстовое содержимое прикладного уровня. Базовые ML-классификаторы по шести числовым признакам (подраздел 3.2.4) на этот кейс по построению не реагируют — поле app_summary в их признаковом пространстве отсутствует. Это первое преимущество гибридного метода из подраздела 3.5: способность работать с тем фрагментом события, который остаётся за пределами привычного для ML числового вектора.</w:t>
       </w:r>
     </w:p>
     <w:p>
@@ -16099,20 +16212,28 @@
     </w:p>
     <w:p>
       <w:r>
-        <w:t>Гибридный метод классифицирует событие как «DoS» с reasoning, ссылающимся на асимметрию объёмов; в evidence — flow.total_bytes_fwd и flow.total_bytes_bwd. Диагностический признак здесь полностью числовой и доступен любому ML-классификатору; гибридный метод выигрывает не уникальной информацией, а способностью построить интерпретацию (явное упоминание amplification и роли коэффициента усиления). При этом кейс не требует разметки на NTP-сессиях — это и есть zero-shot применимость, описанная в подразделе 3.5.</w:t>
+        <w:t>Гибридный метод классифицирует событие как «DoS» с reasoning, ссылающимся на асимметрию объёмов; в evidence — flow.total_bytes_fwd и flow.total_bytes_bwd. Диагностический признак здесь полностью числовой и доступен любому ML-классификатору; гибридный метод выигрывает не уникальной информацией, а способностью построить интерпретацию (явное упоминание amplification и роли коэффициента усиления). Кейс не требует разметки на NTP-сессиях — это и есть zero-shot применимость, описанная в подразделе 3.5.</w:t>
       </w:r>
     </w:p>
     <w:p>
       <w:pPr>
         <w:ind w:firstLine="0"/>
         <w:jc w:val="center"/>
+        <w:rPr>
+          <w:rFonts w:hint="default"/>
+          <w:lang w:val="en-US"/>
+        </w:rPr>
       </w:pPr>
       <w:r>
+        <w:rPr>
+          <w:rFonts w:hint="default"/>
+          <w:lang w:val="en-US"/>
+        </w:rPr>
         <w:drawing>
           <wp:inline distT="0" distB="0" distL="114300" distR="114300">
-            <wp:extent cx="3599815" cy="2407285"/>
-            <wp:effectExtent l="0" t="0" r="23495" b="6350"/>
-            <wp:docPr id="103" name="Picture 103"/>
+            <wp:extent cx="6107430" cy="4081145"/>
+            <wp:effectExtent l="0" t="0" r="13970" b="8255"/>
+            <wp:docPr id="7" name="Picture 7" descr="4385de86-2470-4f13-a7fc-b95095d07187"/>
             <wp:cNvGraphicFramePr>
               <a:graphicFrameLocks xmlns:a="http://schemas.openxmlformats.org/drawingml/2006/main" noChangeAspect="1"/>
             </wp:cNvGraphicFramePr>
@@ -16120,13 +16241,13 @@
               <a:graphicData uri="http://schemas.openxmlformats.org/drawingml/2006/picture">
                 <pic:pic xmlns:pic="http://schemas.openxmlformats.org/drawingml/2006/picture">
                   <pic:nvPicPr>
-                    <pic:cNvPr id="103" name="Picture 103"/>
+                    <pic:cNvPr id="7" name="Picture 7" descr="4385de86-2470-4f13-a7fc-b95095d07187"/>
                     <pic:cNvPicPr>
                       <a:picLocks noChangeAspect="1"/>
                     </pic:cNvPicPr>
                   </pic:nvPicPr>
                   <pic:blipFill>
-                    <a:blip r:embed="rId21"/>
+                    <a:blip r:embed="rId29"/>
                     <a:stretch>
                       <a:fillRect/>
                     </a:stretch>
@@ -16134,7 +16255,7 @@
                   <pic:spPr>
                     <a:xfrm>
                       <a:off x="0" y="0"/>
-                      <a:ext cx="3600000" cy="2408010"/>
+                      <a:ext cx="6107430" cy="4081145"/>
                     </a:xfrm>
                     <a:prstGeom prst="rect">
                       <a:avLst/>
@@ -16159,7 +16280,7 @@
           <w:sz w:val="28"/>
           <w:szCs w:val="28"/>
         </w:rPr>
-        <w:t>Рисунок 15 — Пример диалога с интерпретацией NTP-трафика</w:t>
+        <w:t>Рисунок 18 — Пример диалога с интерпретацией NTP-трафика</w:t>
       </w:r>
     </w:p>
     <w:p>
@@ -16174,12 +16295,12 @@
     </w:p>
     <w:p>
       <w:r>
-        <w:t>Pcap-файл free5gc.pcap сделан в тестовой сети 5G на базе free5GC и содержит NGAP-обмен (RFC 8421) между gNB и AMF на интерфейсе N2: процедура UE Registration с InitialUEMessage, UplinkNASTransport (Registration Request, Authentication Response, Security Mode Complete) и DownlinkNASTransport (Authentication Request, Security Mode Command, Registration Accept). Логика — 3GPP TS 38.413 (NGAP) и TS 24.501 (NAS-5G).</w:t>
-      </w:r>
-    </w:p>
-    <w:p>
-      <w:r>
-        <w:t>Скриншот результата — Рисунок 15. Кейс показывает второе свойство метода — распознавание доменно-специфичных протоколов без дообучения. NGAP-сигнализация отсутствует в общедоступных датасетах (UNSW-NB15, CICIDS2017, USTC-TFC2016 ни одного NGAP-пакета не содержат), но описание интерфейсов 5G и сигнализационных процедур присутствует в обучающем корпусе phi3:mini в виде технических документов и обсуждений. Для классических ML-методов аналогичное потребовало бы разметки и обучения на сотнях NGAP-сессий.</w:t>
+        <w:t>Pcap-файл free5gc.pcap снят в тестовой сети 5G на базе free5GC и содержит NGAP-обмен (RFC 8421) между gNB и AMF на интерфейсе N2: процедура UE Registration с InitialUEMessage, UplinkNASTransport (Registration Request, Authentication Response, Security Mode Complete) и DownlinkNASTransport (Authentication Request, Security Mode Command, Registration Accept). Логика — 3GPP TS 38.413 (NGAP) и TS 24.501 (NAS-5G).</w:t>
+      </w:r>
+    </w:p>
+    <w:p>
+      <w:r>
+        <w:t>Скриншот результата — Рисунок 18. Кейс показывает второе свойство метода — распознавание доменно-специфичных протоколов без дообучения. NGAP-сигнализация отсутствует в общедоступных датасетах (UNSW-NB15, CICIDS2017, USTC-TFC2016 ни одного NGAP-пакета не содержат), но описание интерфейсов 5G и сигнализационных процедур присутствует в обучающем корпусе phi3:mini в виде технических документов и обсуждений. Для классических ML-методов аналогичное потребовало бы разметки и обучения на сотнях NGAP-сессий.</w:t>
       </w:r>
     </w:p>
     <w:p>
@@ -17032,7 +17153,7 @@
     </w:p>
     <w:p>
       <w:r>
-        <w:t>Второе — zero-shot применимость к pcap без меток. Baseline-методы требуют обучения на размеченном датасете и применимы только к данным, признаковое пространство которых совпадает с обучающим. Перенос RandomForest, обученного на UNSW-NB15, на NGAP или SMB-трафик потребует разметки нового набора и переобучения. Гибридный метод работает в zero-shot режиме (подтверждено тремя кейсами подразделе 3.4).</w:t>
+        <w:t>Второе — zero-shot применимость к pcap без меток. Baseline-методы требуют обучения на размеченном датасете и применимы только к данным, признаковое пространство которых совпадает с обучающим. Перенос RandomForest, обученного на UNSW-NB15, на NGAP или SMB-трафик потребует разметки нового набора и переобучения. Гибридный метод работает в zero-shot режиме (подтверждено тремя кейсами подраздела 3.4).</w:t>
       </w:r>
     </w:p>
     <w:p>
@@ -17042,7 +17163,7 @@
     </w:p>
     <w:p>
       <w:r>
-        <w:t>В сравнении с TrafficLLM [20] — наиболее близким известным подходом, дообучающим языковую модель на парах «трафик-метка», — предложенный метод сохраняет нулевой «вес обучения». Вся инженерия признаков перенесена в детерминированную трансляцию T (подразделе 2.3), что даёт три отличия: метод применим без дообучающего набора (TrafficLLM требует разметки на каждый домен), переносим между моделями без переобучения, запускается на CPU без GPU-инфраструктуры (TrafficLLM требует ≥24 ГБ VRAM для дообучения 7B-моделей). Цена простоты — отсутствие специализации модели на классификации трафика.</w:t>
+        <w:t>В сравнении с TrafficLLM [20] — наиболее близким известным подходом, дообучающим языковую модель на парах «трафик-метка», — предложенный метод сохраняет нулевой «вес обучения». Вся инженерия признаков перенесена в детерминированную трансляцию T (подраздел 2.3), что даёт три отличия: метод применим без дообучающего набора (TrafficLLM требует разметки на каждый домен), переносим между моделями без переобучения, запускается на CPU без GPU-инфраструктуры (TrafficLLM требует ≥24 ГБ VRAM для дообучения 7B-моделей). Цена простоты — отсутствие специализации модели на классификации трафика.</w:t>
       </w:r>
     </w:p>
     <w:p>
@@ -17057,12 +17178,12 @@
     </w:p>
     <w:p>
       <w:r>
-        <w:t>В главе представлена программная реализация Local Packet Whisperer и результаты экспериментальной проверки на UNSW-NB15 и реальных pcap-кейсах. Совокупность результатов закрывает задачи 2 и 3 Введения.</w:t>
-      </w:r>
-    </w:p>
-    <w:p>
-      <w:r>
-        <w:t>Реализован модуль Schema Translator (Приложение А.2) — единственная полностью новая компонента системы, ответственная за детерминированную трансляцию T из подразделе 2.3. Модуль покрыт 19 тестами, корректно обрабатывает граничные случаи и на полном тестовом split UNSW-NB15 не зафиксировал отказов парсинга. Доработаны существующие компоненты: Capture Loader (нормализация имён tshark по белому списку), LLM Gateway (метод analyze_event с JSON-mode, retry и пост-фильтром evidence — Приложение А.4) и UI Layer (вкладка Hybrid analysis с визуализацией ответа модели и Markdown-отчётом).</w:t>
+        <w:t>В главе изложены программная реализация Traffic analyzer и результаты экспериментальной проверки на UNSW-NB15 и реальных pcap-кейсах. Совокупность результатов закрывает задачи 2 и 3 Введения.</w:t>
+      </w:r>
+    </w:p>
+    <w:p>
+      <w:r>
+        <w:t>Реализован модуль Schema Translator (Приложение А.2) — единственная полностью новая компонента системы, ответственная за детерминированную трансляцию T из подраздела 2.3. Модуль покрыт 19 тестами, корректно обрабатывает граничные случаи и на полном тестовом split UNSW-NB15 не зафиксировал отказов парсинга. Доработаны существующие компоненты: Capture Loader (нормализация имён tshark по белому списку), LLM Gateway (метод analyze_event с JSON-mode, retry и пост-фильтром evidence — Приложение А.4) и UI Layer (вкладка Hybrid analysis с визуализацией ответа модели и Markdown-отчётом).</w:t>
       </w:r>
     </w:p>
     <w:p>
@@ -17072,7 +17193,7 @@
     </w:p>
     <w:p>
       <w:r>
-        <w:t>H2 подтверждена частично: технический критерий 90% валидных evidence-путей выполнен впритык (89,5%), но содержательная связь между reasoning и evidence по строгому критерию выдержана в 14 из 30 ответов; видна шаблонность reasoning-блоков на однородных событиях. H3 о применимости к pcap без меток подтверждена тремя кейсами подразделе 3.4 (Microsoft NTP, NGAP-сценарий free5gc, обычный TCP-трафик).</w:t>
+        <w:t>H2 подтверждена частично: технический критерий 90% валидных evidence-путей выполнен впритык (89,5%), но содержательная связь между reasoning и evidence по строгому критерию выдержана в 14 из 30 ответов; видна шаблонность reasoning-блоков на однородных событиях. H3 о применимости к pcap без меток подтверждена тремя кейсами подраздела 3.4 (Microsoft NTP, NGAP-сценарий free5gc, обычный TCP-трафик).</w:t>
       </w:r>
     </w:p>
     <w:p>
@@ -17092,7 +17213,7 @@
     </w:p>
     <w:p>
       <w:r>
-        <w:t>В главе строится модель угроз LLM-анализатора трафика и формулируется комплекс политик безопасности. Методологическая основа — Методический документ ФСТЭК России от 05.02.2021 «Методика оценки угроз безопасности информации» [15] и Банк данных угроз безопасности информации ФСТЭК [31], дополненные авторской частью на уровне больших языковых моделей с опорой на OWASP Top 10 for Large Language Model Applications [32]. Содержание соответствует задаче 6 Введения и опирается на архитектуру из Главы 2.</w:t>
+        <w:t>В главе строится модель угроз LLM-анализатора трафика и формулируется комплекс политик безопасности. Методологическая основа — Методический документ ФСТЭК России от 05.02.2021 «Методика оценки угроз безопасности информации» [15] и Банк данных угроз безопасности информации ФСТЭК [31], дополненные авторской частью на уровне больших языковых моделей с опорой на OWASP Top 10 for Large Language Model Applications [32]. Содержание соответствует задаче 6 Введения и опирается на архитектуру из главы 2.</w:t>
       </w:r>
     </w:p>
     <w:p>
@@ -17112,12 +17233,12 @@
     </w:p>
     <w:p>
       <w:r>
-        <w:t>Выделено шесть активов. A1 — pcap/pcapng-файлы, загружаемые пользователем; могут содержать учётные данные, IP внутренней сети и иные чувствительные фрагменты. A2 — программный комплекс LPW (исходный код, веб-интерфейс Streamlit, модули обработки). A3 — локальные веса БЯМ в формате GGUF (не менее 4 ГБ); подмена бинарника даёт прямой канал атаки на reasoning-функцию. A4 — конфигурационные файлы и системные промпты (5g_agent.yaml, шаблоны промптов из 2.3, JSON Schema из Приложения А). A5 — история диалога Streamlit-сессии и Markdown-отчёты. A6 — среда исполнения: Python-окружение, Ollama на порту 11434 и Streamlit на порту 8501.</w:t>
-      </w:r>
-    </w:p>
-    <w:p>
-      <w:r>
-        <w:t>Распределение активов по компонентной схеме показано на Рисунке 16. Цветовая разметка отражает категорию КЦД: красный — высокая конфиденциальность (A1, A5), жёлтый — средняя (A4), синий — программные активы (A2, A3), зелёный — runtime-компоненты с приоритетом доступности (A6).</w:t>
+        <w:t>Выделено шесть активов. A1 — pcap/pcapng-файлы, загружаемые пользователем; могут содержать учётные данные, IP внутренней сети и иные чувствительные фрагменты. A2 — программный комплекс TA (исходный код, веб-интерфейс Streamlit, модули обработки). A3 — локальные веса БЯМ в формате GGUF (не менее 4 ГБ); подмена бинарника даёт прямой канал атаки на reasoning-функцию. A4 — конфигурационные файлы и системные промпты (5g_agent.yaml, шаблоны промптов из 2.3, JSON Schema из Приложения А). A5 — история диалога Streamlit-сессии и Markdown-отчёты. A6 — среда исполнения: Python-окружение, Ollama на порту 11434 и Streamlit на порту 8501.</w:t>
+      </w:r>
+    </w:p>
+    <w:p>
+      <w:r>
+        <w:t>Распределение активов по компонентной схеме показано на Рисунке 19. Цветовая разметка отражает категорию КЦД: красный — высокая конфиденциальность (A1, A5), жёлтый — средняя (A4), синий — программные активы (A2, A3), зелёный — runtime-компоненты с приоритетом доступности (A6).</w:t>
       </w:r>
     </w:p>
     <w:p>
@@ -17127,8 +17248,8 @@
       <w:r>
         <w:drawing>
           <wp:inline distT="0" distB="0" distL="114300" distR="114300">
-            <wp:extent cx="5759450" cy="3650615"/>
-            <wp:effectExtent l="0" t="0" r="23495" b="5080"/>
+            <wp:extent cx="5450205" cy="3272790"/>
+            <wp:effectExtent l="0" t="0" r="10795" b="3810"/>
             <wp:docPr id="18" name="Picture 18"/>
             <wp:cNvGraphicFramePr>
               <a:graphicFrameLocks xmlns:a="http://schemas.openxmlformats.org/drawingml/2006/main" noChangeAspect="1"/>
@@ -17143,7 +17264,7 @@
                     </pic:cNvPicPr>
                   </pic:nvPicPr>
                   <pic:blipFill>
-                    <a:blip r:embed="rId22"/>
+                    <a:blip r:embed="rId30"/>
                     <a:stretch>
                       <a:fillRect/>
                     </a:stretch>
@@ -17151,7 +17272,7 @@
                   <pic:spPr>
                     <a:xfrm>
                       <a:off x="0" y="0"/>
-                      <a:ext cx="5760000" cy="3650675"/>
+                      <a:ext cx="5450205" cy="3272790"/>
                     </a:xfrm>
                     <a:prstGeom prst="rect">
                       <a:avLst/>
@@ -17171,7 +17292,7 @@
         <w:jc w:val="center"/>
       </w:pPr>
       <w:r>
-        <w:t>Рисунок 16 — Защищаемые активы LPW на компонентной схеме</w:t>
+        <w:t>Рисунок 19 — Защищаемые активы TA на компонентной схеме</w:t>
       </w:r>
     </w:p>
     <w:p>
@@ -17186,7 +17307,7 @@
         <w:jc w:val="left"/>
       </w:pPr>
       <w:r>
-        <w:t>Таблица 9 — Защищаемые активы LPW и категории КЦД по ГОСТ Р 50.1.056</w:t>
+        <w:t>Таблица 9 — Защищаемые активы TA и категории КЦД по ГОСТ Р 50.1.056</w:t>
       </w:r>
     </w:p>
     <w:tbl>
@@ -18334,7 +18455,7 @@
     </w:p>
     <w:p>
       <w:r>
-        <w:t>Из шкалы выделены три типа нарушителей, релевантных профилю LPW. N1 — внешний нарушитель с низким потенциалом. Это участник вне периметра хоста, у которого нет ни сетевого доступа к Ollama или Streamlit (они слушают на 127.0.0.1), ни прав на файловую систему пользователя. Единственный доступный ему канал — подготовка вредоносного pcap и передача его аналитику любым внешним способом (e-mail, мессенджер, общий ресурс). Цель — вынудить систему выдать ложный результат либо раскрыть содержимое системного промпта.</w:t>
+        <w:t>Из шкалы выделены три типа нарушителей, релевантных профилю TA. N1 — внешний нарушитель с низким потенциалом. Это участник вне периметра хоста, у которого нет ни сетевого доступа к Ollama или Streamlit (они слушают на 127.0.0.1), ни прав на файловую систему пользователя. Единственный доступный ему канал — подготовка вредоносного pcap и передача его аналитику любым внешним способом (e-mail, мессенджер, общий ресурс). Цель — вынудить систему выдать ложный результат либо раскрыть содержимое системного промпта.</w:t>
       </w:r>
     </w:p>
     <w:p>
@@ -18344,7 +18465,7 @@
     </w:p>
     <w:p>
       <w:r>
-        <w:t>N3 — внутренний нарушитель с повышенным потенциалом: разработчик или администратор системы. Помимо возможностей N2 имеет права записи на каталог с весами Ollama, на конфигурационные файлы и на исходный код LPW. Цели — подмена весов БЯМ, изменение системных промптов, эксфильтрация pcap-файлов и отчётов на внешний носитель.</w:t>
+        <w:t>N3 — внутренний нарушитель с повышенным потенциалом: разработчик или администратор системы. Помимо возможностей N2 имеет права записи на каталог с весами Ollama, на конфигурационные файлы и на исходный код TA. Цели — подмена весов БЯМ, изменение системных промптов, эксфильтрация pcap-файлов и отчётов на внешний носитель.</w:t>
       </w:r>
     </w:p>
     <w:p>
@@ -18632,7 +18753,7 @@
                 <w:sz w:val="24"/>
                 <w:szCs w:val="24"/>
               </w:rPr>
-              <w:t>Открытая документация LPW, открытые веса БЯМ, общеизвестные техники prompt injection</w:t>
+              <w:t>Открытая документация TA, открытые веса БЯМ, общеизвестные техники prompt injection</w:t>
             </w:r>
           </w:p>
         </w:tc>
@@ -18878,7 +18999,7 @@
                 <w:sz w:val="24"/>
                 <w:szCs w:val="24"/>
               </w:rPr>
-              <w:t>Доступ на запись к docs/, к каталогу весов Ollama, к коду lpw_*.py</w:t>
+              <w:t>Доступ на запись к docs/, к каталогу весов Ollama, к коду ta_*.py</w:t>
             </w:r>
           </w:p>
         </w:tc>
@@ -18930,7 +19051,7 @@
     </w:tbl>
     <w:p>
       <w:r>
-        <w:t>Граничные условия модели зафиксированы явно. Не рассматриваются нарушители с возможностями, выходящими за рамки [15] для повышенного потенциала: спецслужбы, группы с долгосрочным аппаратным доступом к хосту, атакующие с возможностью физической компрометации железа. Не рассматривается также сценарий компрометации операционной системы как таковой: в нём бессмысленны любые контрмеры на уровне приложения. Эти границы соответствуют классификации «не выше повышенного» из раздела 5 [15] и охватывают практический спектр угроз для академического и корпоративного использования LPW.</w:t>
+        <w:t>Граничные условия модели зафиксированы явно. Не рассматриваются нарушители с возможностями, выходящими за рамки [15] для повышенного потенциала: спецслужбы, группы с долгосрочным аппаратным доступом к хосту, атакующие с возможностью физической компрометации железа. Не рассматривается также сценарий компрометации операционной системы как таковой: в нём бессмысленны любые контрмеры на уровне приложения. Эти границы соответствуют классификации «не выше повышенного» из раздела 5 [15] и охватывают практический спектр угроз для академического и корпоративного использования TA.</w:t>
       </w:r>
     </w:p>
     <w:p>
@@ -18945,17 +19066,17 @@
     </w:p>
     <w:p>
       <w:r>
-        <w:t>Базовый каталог угроз — Банк данных угроз ФСТЭК [31]. Поскольку BDU охватывает всю отрасль, для LLM-анализатора, исполняемого как локальное приложение, релевантна узкая выборка. Применимость угрозы оценивалась по трём критериям профиля: (1) наличие в системе соответствующего объекта воздействия из перечня A1–A6; (2) реализуемость способа атаки в условиях LPW (без сетевого периметра, без многопользовательской БД, при привязке Streamlit и Ollama к 127.0.0.1); (3) соответствие модели нарушителя (N1–N3) с потенциалом не выше повышенного.</w:t>
-      </w:r>
-    </w:p>
-    <w:p>
-      <w:r>
-        <w:t>В выборку включены шесть угроз БДУ, охватывающих четыре класса: нарушение конфиденциальности (T1), целостности (T2), доступности (T3) и компрометация цепочки поставок (T4–T6). Уязвимости классифицируются по ГОСТ Р 56546-2015 [34] на конфигурации, реализации и архитектуры; от их типа зависит уровень контрмеры: настройка экземпляра, изменение кода LPW или пересмотр компонентной схемы из 2.4 соответственно.</w:t>
-      </w:r>
-    </w:p>
-    <w:p>
-      <w:r>
-        <w:t>Сценарии реализации угроз для LPW описаны ниже.</w:t>
+        <w:t>Базовый каталог угроз — Банк данных угроз ФСТЭК [31]. Поскольку BDU охватывает всю отрасль, для LLM-анализатора, исполняемого как локальное приложение, релевантна узкая выборка. Применимость угрозы оценивалась по трём критериям профиля: (1) наличие в системе соответствующего объекта воздействия из перечня A1–A6; (2) реализуемость способа атаки в условиях TA (без сетевого периметра, без многопользовательской БД, при привязке Streamlit и Ollama к 127.0.0.1); (3) соответствие модели нарушителя (N1–N3) с потенциалом не выше повышенного.</w:t>
+      </w:r>
+    </w:p>
+    <w:p>
+      <w:r>
+        <w:t>В выборку включены шесть угроз БДУ, охватывающих четыре класса: нарушение конфиденциальности (T1), целостности (T2), доступности (T3) и компрометация цепочки поставок (T4–T6). Уязвимости классифицируются по ГОСТ Р 56546-2015 [34] на конфигурации, реализации и архитектуры; от их типа зависит уровень контрмеры: настройка экземпляра, изменение кода TA или пересмотр компонентной схемы из 2.4 соответственно.</w:t>
+      </w:r>
+    </w:p>
+    <w:p>
+      <w:r>
+        <w:t>Сценарии реализации угроз для TA описаны ниже.</w:t>
       </w:r>
     </w:p>
     <w:p>
@@ -18965,7 +19086,7 @@
     </w:p>
     <w:p>
       <w:r>
-        <w:t>T2 (УБИ.114, нарушение целостности информации): нарушитель N3 редактирует системный промпт или конфигурацию агента (5g_agent.yaml), что меняет поведение модели на всех последующих запросах. Объект воздействия — A4. Уязвимое место — реализация: отсутствует контроль целостности (хеш-файлы, цифровая подпись). Подмена системного промпта особенно опасна для обоснованности отчётов A5, поскольку модель продолжает выдавать структурно валидный JSON, но с искажённой интерпретацией событий, что не обнаруживается JSON Schema-валидатором из подраздела 2.3.</w:t>
+        <w:t>T2 (УБИ.114, нарушение целостности информации): нарушитель N3 редактирует системный промпт или конфигурацию агента (5g_agent.yaml), что меняет поведение модели на всех последующих запросах. Объект воздействия — A4. Уязвимое место — реализация: отсутствует контроль целостности (хеш-файлы, цифровая подпись). Подмена системного промпта особенно опасна для обоснованности отчётов A5: модель продолжает выдавать структурно валидный JSON, но с искажённой интерпретацией событий, что не обнаруживается JSON Schema-валидатором из подраздела 2.3.</w:t>
       </w:r>
     </w:p>
     <w:p>
@@ -18975,7 +19096,7 @@
     </w:p>
     <w:p>
       <w:r>
-        <w:t>T4 (УБИ.034, внедрение вредоносного ПО через зависимости): нарушитель N1 размещает в публичном репозитории пакет с именем, близким к легитимной зависимости (typosquatting), либо компрометирует учётную запись мейнтейнера и публикует вредоносную версию. При следующем pip install -r requirements.txt вредоносный код выполняется в контексте пользователя. Объект воздействия — A2, A6. Уязвимое место — реализация: отсутствует pinning точных версий и pip-audit в CI. В контексте LPW дерево зависимостей включает PyShark, Streamlit и связанные с ними транзитивные пакеты, поэтому суммарная поверхность атаки исчисляется десятками сторонних модулей.</w:t>
+        <w:t>T4 (УБИ.034, внедрение вредоносного ПО через зависимости): нарушитель N1 размещает в публичном репозитории пакет с именем, близким к легитимной зависимости (typosquatting), либо компрометирует учётную запись мейнтейнера и публикует вредоносную версию. При следующем pip install -r requirements.txt вредоносный код выполняется в контексте пользователя. Объект воздействия — A2, A6. Уязвимое место — реализация: отсутствует pinning точных версий и pip-audit в CI. В контексте TA дерево зависимостей включает PyShark, Streamlit и связанные с ними транзитивные пакеты, поэтому суммарная поверхность атаки исчисляется десятками сторонних модулей.</w:t>
       </w:r>
     </w:p>
     <w:p>
@@ -18985,7 +19106,7 @@
     </w:p>
     <w:p>
       <w:r>
-        <w:t>T6 (УБИ.187, компрометация цепочки поставок): нарушитель N1 подменяет публикуемые веса Ollama (ollama pull &lt;модель&gt;) либо upstream-пакет PyShark. При следующем обновлении пользователь получает вредоносную версию. Объект воздействия — A2, A3. Уязвимое место — архитектура: не проверяются хеши получаемых артефактов. В отличие от T4, сценарий T6 затрагивает не только исполняемый код, но и веса БЯМ A3 — компонент, который не подлежит традиционному статическому анализу и выявление вредоносного встраивания в reasoning-модель в общем случае является нерешённой задачей.</w:t>
+        <w:t>T6 (УБИ.187, компрометация цепочки поставок): нарушитель N1 подменяет публикуемые веса Ollama (ollama pull &lt;модель&gt;) либо upstream-пакет PyShark. При следующем обновлении пользователь получает вредоносную версию. Объект воздействия — A2, A3. Уязвимое место — архитектура: не проверяются хеши получаемых артефактов. В отличие от T4, сценарий T6 затрагивает не только исполняемый код, но и веса БЯМ A3 — компонент, который не подлежит традиционному статическому анализу; выявление вредоносного встраивания в reasoning-модель в общем случае является нерешённой задачей.</w:t>
       </w:r>
     </w:p>
     <w:p>
@@ -19000,7 +19121,7 @@
         <w:jc w:val="left"/>
       </w:pPr>
       <w:r>
-        <w:t>Таблица 11 — Применимые угрозы из БДУ ФСТЭК для LPW</w:t>
+        <w:t>Таблица 11 — Применимые угрозы из БДУ ФСТЭК для TA</w:t>
       </w:r>
     </w:p>
     <w:tbl>
@@ -19117,7 +19238,7 @@
                 <w:sz w:val="24"/>
                 <w:szCs w:val="24"/>
               </w:rPr>
-              <w:t>Сценарий применительно к LPW</w:t>
+              <w:t>Сценарий применительно к TA</w:t>
             </w:r>
           </w:p>
         </w:tc>
@@ -20004,7 +20125,7 @@
                     </pic:cNvPicPr>
                   </pic:nvPicPr>
                   <pic:blipFill>
-                    <a:blip r:embed="rId23"/>
+                    <a:blip r:embed="rId31"/>
                     <a:stretch>
                       <a:fillRect/>
                     </a:stretch>
@@ -20032,7 +20153,7 @@
         <w:jc w:val="center"/>
       </w:pPr>
       <w:r>
-        <w:t>Рисунок 17 — Векторы LLM-атак на компоненты LPW</w:t>
+        <w:t>Рисунок 20 — Векторы LLM-атак на компоненты TA</w:t>
       </w:r>
     </w:p>
     <w:p>
@@ -20178,7 +20299,7 @@
                 <w:sz w:val="24"/>
                 <w:szCs w:val="24"/>
               </w:rPr>
-              <w:t>Сценарий в LPW</w:t>
+              <w:t>Сценарий в TA</w:t>
             </w:r>
           </w:p>
         </w:tc>
@@ -21002,7 +21123,7 @@
     </w:p>
     <w:p>
       <w:r>
-        <w:t>Угроза признаётся актуальной по методике ФСТЭК-2021, если одновременно определены источник, объект воздействия и способ реализации, а также установлены возможные последствия [15]. Для всех 13 угроз модели LPW T1–T6 и L1–L7 оценка по этим четырём показателям сведена в таблицу 13.</w:t>
+        <w:t>Угроза признаётся актуальной по методике ФСТЭК-2021, если одновременно определены источник, объект воздействия и способ реализации, а также установлены возможные последствия [15]. Для всех 13 угроз модели TA T1–T6 и L1–L7 оценка по этим четырём показателям сведена в Таблицу 13.</w:t>
       </w:r>
     </w:p>
     <w:p>
@@ -22933,7 +23054,7 @@
     </w:p>
     <w:p>
       <w:r>
-        <w:t>Контрмеры строятся по принципу defense-in-depth: атака должна последовательно преодолеть восемь независимых контуров (Рисунки 18–20). Контур 0 — среда хоста — наследуется от ОС и в LPW специфических настроек не имеет; в дальнейшем не рассматривается. Контуры 1–7 относятся к собственным точкам управления приложения. Каждая угроза T1–T6 и L1–L7 закрывается одной или несколькими политиками P1–P15 (Таблица 14). Привязка к нормативной базе — Приказы ФСТЭК России № 17 [35] и № 21 [36] для угроз из БДУ, типовые меры из Методики [15]; для LLM-уровня — категории OWASP Top 10 [32].</w:t>
+        <w:t>Контрмеры строятся по принципу defense-in-depth: атака должна последовательно преодолеть восемь независимых контуров (Рисунки 21–23). Контур 0 — среда хоста — наследуется от ОС и в TA специфических настроек не имеет; в дальнейшем не рассматривается. Контуры 1–7 относятся к собственным точкам управления приложения. Каждая угроза T1–T6 и L1–L7 закрывается одной или несколькими политиками P1–P15 (Таблица 14). Привязка к нормативной базе — Приказы ФСТЭК России № 17 [35] и № 21 [36] для угроз из БДУ, типовые меры из Методики [15]; для LLM-уровня — категории OWASP Top 10 [32].</w:t>
       </w:r>
     </w:p>
     <w:p>
@@ -22959,7 +23080,7 @@
                     </pic:cNvPicPr>
                   </pic:nvPicPr>
                   <pic:blipFill>
-                    <a:blip r:embed="rId24"/>
+                    <a:blip r:embed="rId32"/>
                     <a:stretch>
                       <a:fillRect/>
                     </a:stretch>
@@ -22987,7 +23108,7 @@
         <w:jc w:val="center"/>
       </w:pPr>
       <w:r>
-        <w:t>Рисунок 18 — Защитные контуры LPW (defense-in-depth): хост, сетевой периметр, supply chain (контуры 0–2)</w:t>
+        <w:t>Рисунок 21 — Защитные контуры TA (defense-in-depth): хост, сетевой периметр, supply chain (контуры 0–2)</w:t>
       </w:r>
     </w:p>
     <w:p>
@@ -23013,7 +23134,7 @@
                     </pic:cNvPicPr>
                   </pic:nvPicPr>
                   <pic:blipFill>
-                    <a:blip r:embed="rId25"/>
+                    <a:blip r:embed="rId33"/>
                     <a:stretch>
                       <a:fillRect/>
                     </a:stretch>
@@ -23041,7 +23162,7 @@
         <w:jc w:val="center"/>
       </w:pPr>
       <w:r>
-        <w:t>Рисунок 19 — Защитные контуры LPW (defense-in-depth): файловая система, валидация ввода, LLM Gateway (контуры 3–5)</w:t>
+        <w:t>Рисунок 22 — Защитные контуры TA (defense-in-depth): файловая система, валидация ввода, LLM Gateway (контуры 3–5)</w:t>
       </w:r>
     </w:p>
     <w:p>
@@ -23067,7 +23188,7 @@
                     </pic:cNvPicPr>
                   </pic:nvPicPr>
                   <pic:blipFill>
-                    <a:blip r:embed="rId26"/>
+                    <a:blip r:embed="rId34"/>
                     <a:stretch>
                       <a:fillRect/>
                     </a:stretch>
@@ -23095,27 +23216,27 @@
         <w:jc w:val="center"/>
       </w:pPr>
       <w:r>
-        <w:t>Рисунок 20 — Защитные контуры LPW (defense-in-depth): UI Layer и мониторинг (контуры 6–7)</w:t>
-      </w:r>
-    </w:p>
-    <w:p>
-      <w:r>
-        <w:t>Контур 1 (сетевой периметр). Меры P5: Ollama и Streamlit запускаются с привязкой к 127.0.0.1, что отрезает все сетевые источники атаки на N1. Эта мера в LPW уже реализована в текущей кодовой базе — конфигурации запуска bin/lpw_home.py и точка инициализации Ollama по умолчанию используют localhost. Дополнительная страховка — политика локального firewall с правилом deny на входящие 8501 и 11434.</w:t>
-      </w:r>
-    </w:p>
-    <w:p>
-      <w:r>
-        <w:t>Контур 2 (supply chain). Меры P4 и P6 закрывают T4 и T6: pinning точных версий зависимостей в requirements.txt, регулярный прогон pip-audit, сверка SHA-256 весов GGUF при ollama pull. На текущий момент requirements.txt LPW не закреплён по версиям — это добавляется в рамках работы. Контроль хешей весов также добавляется как новая мера: реализация — обёртка над ollama pull со сверкой по списку контрольных значений из конфигурации.</w:t>
-      </w:r>
-    </w:p>
-    <w:p>
-      <w:r>
-        <w:t>Контур 3 (файловая система). Меры P1, P2 закрывают T1 и T2. P1 — установка chmod 600 на temp/ и отчёты, очистка temp/ по окончании сессии Streamlit, исключение неконтролируемых остатков прошлых пользователей. P2 — контроль целостности конфигурационных файлов (5g_agent.yaml, schema_v1.json, шаблонов промптов) через SHA-256: при старте приложения проверяется соответствие фактических хешей зафиксированным эталонам; расхождение логируется и блокирует запуск. Обе меры — добавляются в рамках работы.</w:t>
-      </w:r>
-    </w:p>
-    <w:p>
-      <w:r>
-        <w:t>Контур 5 (LLM Gateway). Меры P3 (тайм-аут запроса, ретрай ≤2 с экспоненциальным бэкоффом), P10 (лимит токенов промпта 2048), P8 (полный контроль над содержимым системного промпта, отказ возвращать его на пользовательские запросы). На текущий момент bin/lpw_ollamaClient.py уже реализует тайм-ауты и контроль формата ответа; добавляется проверка размера промпта и расширенное логирование причин отказа.</w:t>
+        <w:t>Рисунок 23 — Защитные контуры TA (defense-in-depth): UI Layer и мониторинг (контуры 6–7)</w:t>
+      </w:r>
+    </w:p>
+    <w:p>
+      <w:r>
+        <w:t>Контур 1 (сетевой периметр). Меры P5: Ollama и Streamlit запускаются с привязкой к 127.0.0.1, что отрезает все сетевые источники атаки на N1. Эта мера в TA уже реализована в текущей кодовой базе — конфигурации запуска bin/ta_home.py и точка инициализации Ollama по умолчанию используют localhost. Дополнительная страховка — политика локального firewall с правилом deny на входящие 8501 и 11434.</w:t>
+      </w:r>
+    </w:p>
+    <w:p>
+      <w:r>
+        <w:t>Контур 2 (supply chain). Меры P4 и P6 закрывают T4 и T6: pinning точных версий зависимостей в requirements.txt, регулярный прогон pip-audit, сверка SHA-256 весов GGUF при ollama pull. На текущий момент requirements.txt TA не закреплён по версиям — это добавляется в рамках работы. Контроль хешей весов также добавляется как новая мера: реализация — обёртка над ollama pull со сверкой по списку контрольных значений из конфигурации.</w:t>
+      </w:r>
+    </w:p>
+    <w:p>
+      <w:r>
+        <w:t>Контур 3 (файловая система). Меры P1, P2 закрывают T1 и T2. P1 — установка chmod 600 на temp/ и отчёты, очистка temp/ по окончании сессии Streamlit, исключение неконтролируемых остатков прошлых пользователей. P2 — контроль целостности конфигурационных файлов (5g_agent.yaml, schema_v1.json, шаблонов промптов) через SHA-256: при старте приложения проверяется соответствие фактических хешей зафиксированным эталонам; расхождение логируется и блокирует запуск. Обе меры добавляются в рамках работы.</w:t>
+      </w:r>
+    </w:p>
+    <w:p>
+      <w:r>
+        <w:t>Контур 5 (LLM Gateway). Меры P3 (тайм-аут запроса, ретрай ≤2 с экспоненциальным бэкоффом), P10 (лимит токенов промпта 2048), P8 (полный контроль над содержимым системного промпта, отказ возвращать его на пользовательские запросы). На текущий момент bin/ta_ollamaClient.py уже реализует тайм-ауты и контроль формата ответа; добавляется проверка размера промпта и расширенное логирование причин отказа.</w:t>
       </w:r>
     </w:p>
     <w:p>
@@ -24966,7 +25087,7 @@
     </w:p>
     <w:p>
       <w:r>
-        <w:t>Раздел артефактов. Текущая кодовая база local-packet-whisperer/ уже реализует: Capture Loader (bin/lpw_packet.py), LLM Gateway (bin/lpw_ollamaClient.py), UI Layer (bin/lpw_home.py, bin/lpw_settings.py), Reasoning Agent с whitelist (bin/lpw_agent.py + 5g_agent.yaml). Schema Translator как отдельный модуль отсутствует и вводится впервые в Главе 3, что отражено в столбце «Статус» Таблицы 14: меры P1, P2, P3, P4, P6, P7, P10, P11 — добавляются в рамках работы; P5, P8, P9, P13, P14, P15 — уже реализованы; P12 — частично, требует доработки whitelist при росте набора инструментов.</w:t>
+        <w:t>Раздел артефактов. Текущая кодовая база traffic-analyzer/ уже реализует: Capture Loader (bin/ta_packet.py), LLM Gateway (bin/ta_ollamaClient.py), UI Layer (bin/ta_home.py, bin/ta_settings.py), Reasoning Agent с whitelist (bin/ta_agent.py + 5g_agent.yaml). Schema Translator как отдельный модуль отсутствует и вводится впервые в главе 3, что отражено в столбце «Статус» Таблицы 14: меры P1, P2, P3, P4, P6, P7, P10, P11 — добавляются в рамках работы; P5, P8, P9, P13, P14, P15 — уже реализованы; P12 — частично, требует доработки whitelist при росте набора инструментов.</w:t>
       </w:r>
     </w:p>
     <w:p>
@@ -24986,7 +25107,7 @@
     </w:p>
     <w:p>
       <w:r>
-        <w:t>Идентифицированы шесть защищаемых активов A1–A6 с категориями КЦД по ГОСТ Р 50.1.056 [33]; распределение активов по компонентной схеме показано на Рисунке 16, формальные категории — в Таблице 9.</w:t>
+        <w:t>Идентифицированы шесть защищаемых активов A1–A6 с категориями КЦД по ГОСТ Р 50.1.056 [33]; распределение активов по компонентной схеме показано на Рисунке 19, формальные категории — в Таблице 9.</w:t>
       </w:r>
     </w:p>
     <w:p>
@@ -25001,7 +25122,7 @@
     </w:p>
     <w:p>
       <w:r>
-        <w:t>На уровне БЯМ выделены семь угроз L1–L7 на основе OWASP Top 10 for LLM Applications [32], с привязкой к специфике LPW: indirect prompt injection через содержимое pcap [19; 31], раскрытие системного промпта, небезопасный рендер вывода, DoS промпта, supply chain весов, excessive agency CrewAI, ИБ-критическая галлюцинация. Векторы атак показаны на Рисунке 17; проекция на БДУ — в Таблице 12. Авторская позиция: галлюцинация выделена как самостоятельная угроза, не имеющая прямого аналога в БДУ.</w:t>
+        <w:t>На уровне БЯМ выделены семь угроз L1–L7 на основе OWASP Top 10 for LLM Applications [32], с привязкой к специфике TA: indirect prompt injection через содержимое pcap [19; 31], раскрытие системного промпта, небезопасный рендер вывода, DoS промпта, supply chain весов, excessive agency CrewAI, ИБ-критическая галлюцинация. Векторы атак показаны на Рисунке 20; проекция на БДУ — в Таблице 12. Авторская позиция: галлюцинация выделена как самостоятельная угроза, не имеющая прямого аналога в БДУ.</w:t>
       </w:r>
     </w:p>
     <w:p>
@@ -25011,7 +25132,7 @@
     </w:p>
     <w:p>
       <w:r>
-        <w:t>Для каждой угрозы определена контрмера P1–P15 (Таблица 14) с явной отметкой статуса в текущей кодовой базе LPW: меры на сетевую изоляцию, безопасный рендер, контроль системного промпта и whitelist агента уже реализованы; меры на supply chain, контроль целостности конфигов, sanitization ввода LLM и контроль галлюцинаций добавляются в рамках работы. Защитные контуры собраны в схему defense-in-depth (Рисунки 18–20).</w:t>
+        <w:t>Для каждой угрозы определена контрмера P1–P15 (Таблица 14) с явной отметкой статуса в текущей кодовой базе TA: меры на сетевую изоляцию, безопасный рендер, контроль системного промпта и whitelist агента уже реализованы; меры на supply chain, контроль целостности конфигов, sanitization ввода LLM и контроль галлюцинаций добавляются в рамках работы. Защитные контуры собраны в схему defense-in-depth (Рисунки 21–23).</w:t>
       </w:r>
     </w:p>
     <w:p>
@@ -25032,7 +25153,7 @@
     </w:p>
     <w:p>
       <w:r>
-        <w:t>В рамках выпускной квалификационной работы достигнута поставленная цель — разработан метод гибридного анализа сетевого трафика на основе локальной большой языковой модели и реализующее его программное решение Local Packet Whisperer. Решены все шесть задач, сформулированных во введении: проведён аналитический обзор существующих подходов к анализу трафика, локальных движков исполнения языковых моделей и метрик качества классификации; формализована двухуровневая схема NetworkEvent в JSON Schema 2020-12; разработан метод трансляции pcap в схему и далее в промпт и шлюз локальной языковой модели в режиме JSON-mode с гарантией валидности ответа; реализовано программное решение на стеке Python, Streamlit, Ollama, PyShark, Scapy и scikit-learn; проведена экспериментальная проверка метода на наборе UNSW-NB15 с сопоставлением с базовыми классификаторами; построена модель угроз и сформированы политики безопасности в соответствии с методикой оценки угроз ФСТЭК России 2021 года.</w:t>
+        <w:t>В рамках выпускной квалификационной работы достигнута поставленная цель — разработан метод гибридного анализа сетевого трафика на основе локальной большой языковой модели и реализующее его программное решение Traffic analyzer. Решены все шесть задач, сформулированных во введении: проведён аналитический обзор существующих подходов к анализу трафика, локальных движков исполнения языковых моделей и метрик качества классификации; формализована двухуровневая схема NetworkEvent в JSON Schema 2020-12; разработан метод трансляции pcap в схему и далее в промпт и шлюз локальной языковой модели в режиме JSON-mode с гарантией валидности ответа; реализовано программное решение на стеке Python, Streamlit, Ollama, PyShark, Scapy и scikit-learn; проведена экспериментальная проверка метода на наборе UNSW-NB15 с сопоставлением с базовыми классификаторами; построена модель угроз и сформированы политики безопасности в соответствии с методикой оценки угроз ФСТЭК России 2021 года.</w:t>
       </w:r>
     </w:p>
     <w:p>
@@ -25047,7 +25168,7 @@
     </w:p>
     <w:p>
       <w:r>
-        <w:t>В третьей главе изложена программная реализация решения Local Packet Whisperer. Описаны компоненты schema_translator.py, lpw_ollamaClient.py, скрипты препроцессинга, базового и гибридного экспериментов, пользовательский интерфейс на платформе Streamlit с вкладкой гибридного анализа. Проведён эксперимент на 1000 записях набора UNSW-NB15. Базовый классификатор Random Forest показал значения Precision_macro 0,929, Recall_macro 0,931, F1_macro 0,930 и PR-AUC 0,986; Logistic Regression — F1_macro 0,685; MLP — F1_macro 0,864. Гибридный метод на модели phi3:mini показал значения Precision_macro 0,441, Recall_macro 0,490, F1_macro 0,421, F1_weighted 0,567, PR-AUC 0,688 при суммарном времени прогона 9807,5 секунд (около 2,7 часа), 35 ошибках инференса и 7 восстановленных запросах после повторов. Полученные результаты подтверждают функциональную работоспособность метода и одновременно выявляют отставание локальной малой модели от базовых классификаторов в текущей конфигурации.</w:t>
+        <w:t>В третьей главе изложена программная реализация решения Traffic analyzer. Описаны компоненты schema_translator.py, ta_ollamaClient.py, скрипты препроцессинга, базового и гибридного экспериментов, пользовательский интерфейс на платформе Streamlit с вкладкой гибридного анализа. Проведён эксперимент на 1000 записях набора UNSW-NB15. Базовый классификатор Random Forest показал значения Precision_macro 0,929, Recall_macro 0,931, F1_macro 0,930 и PR-AUC 0,986; Logistic Regression — F1_macro 0,685; MLP — F1_macro 0,864. Гибридный метод на модели phi3:mini показал значения Precision_macro 0,441, Recall_macro 0,490, F1_macro 0,421, F1_weighted 0,567, PR-AUC 0,688 при суммарном времени прогона 9807,5 секунд (около 2,7 часа), 35 ошибках инференса и 7 восстановленных запросах после повторов. Полученные результаты подтверждают функциональную работоспособность метода и одновременно выявляют отставание локальной малой модели от базовых классификаторов в текущей конфигурации.</w:t>
       </w:r>
     </w:p>
     <w:p>
@@ -25062,7 +25183,7 @@
     </w:p>
     <w:p>
       <w:r>
-        <w:t>Практическая значимость работы заключается в разработке программного решения Local Packet Whisperer с открытым исходным кодом, пригодного для применения в локальной инфраструктуре оператора без передачи трафика во внешние сервисы, и в воспроизводимом сценарии эксперимента, фиксированном в документе EXPERIMENT_README.md. Корректность реализации подтверждена набором из 36 проходящих модульных тестов, охватывающих контракт схемы NetworkEvent, поведение шлюза локальной модели, процедуры препроцессинга и базовый классификатор. Сформированная модель угроз и политики безопасности увязаны с банком данных угроз ФСТЭК и с методикой оценки угроз ФСТЭК 2021 года, что обеспечивает применимость результатов в действующих процессах оценки соответствия и в учебных стендах подразделений информационной безопасности.</w:t>
+        <w:t>Практическая значимость работы заключается в разработке программного решения Traffic analyzer с открытым исходным кодом, пригодного для применения в локальной инфраструктуре оператора без передачи трафика во внешние сервисы, и в воспроизводимом сценарии эксперимента, фиксированном в документе EXPERIMENT_README.md. Корректность реализации подтверждена набором из 36 проходящих модульных тестов, охватывающих контракт схемы NetworkEvent, поведение шлюза локальной модели, процедуры препроцессинга и базовый классификатор. Сформированная модель угроз и политики безопасности увязаны с банком данных угроз ФСТЭК и с методикой оценки угроз ФСТЭК 2021 года, что обеспечивает применимость результатов в действующих процессах оценки соответствия и в учебных стендах подразделений информационной безопасности.</w:t>
       </w:r>
     </w:p>
     <w:p>
@@ -25406,7 +25527,12 @@
       </w:r>
     </w:p>
     <w:sectPr>
-      <w:footerReference r:id="rId5" w:type="default"/>
+      <w:headerReference r:id="rId7" w:type="first"/>
+      <w:footerReference r:id="rId10" w:type="first"/>
+      <w:headerReference r:id="rId5" w:type="default"/>
+      <w:footerReference r:id="rId8" w:type="default"/>
+      <w:headerReference r:id="rId6" w:type="even"/>
+      <w:footerReference r:id="rId9" w:type="even"/>
       <w:pgSz w:w="11906" w:h="16838"/>
       <w:pgMar w:top="1134" w:right="567" w:bottom="1134" w:left="1701" w:header="709" w:footer="709" w:gutter="0"/>
       <w:cols w:space="720" w:num="1"/>
@@ -25497,6 +25623,18 @@
 </w:ftr>
 </file>
 
+<file path=word/footer2.xml><?xml version="1.0" encoding="utf-8"?>
+<w:ftr xmlns:wpc="http://schemas.microsoft.com/office/word/2010/wordprocessingCanvas" xmlns:mc="http://schemas.openxmlformats.org/markup-compatibility/2006" xmlns:o="urn:schemas-microsoft-com:office:office" xmlns:r="http://schemas.openxmlformats.org/officeDocument/2006/relationships" xmlns:m="http://schemas.openxmlformats.org/officeDocument/2006/math" xmlns:v="urn:schemas-microsoft-com:vml" xmlns:wp14="http://schemas.microsoft.com/office/word/2010/wordprocessingDrawing" xmlns:wp="http://schemas.openxmlformats.org/drawingml/2006/wordprocessingDrawing" xmlns:w10="urn:schemas-microsoft-com:office:word" xmlns:w="http://schemas.openxmlformats.org/wordprocessingml/2006/main" xmlns:w14="http://schemas.microsoft.com/office/word/2010/wordml" xmlns:w15="http://schemas.microsoft.com/office/word/2012/wordml" xmlns:wpg="http://schemas.microsoft.com/office/word/2010/wordprocessingGroup" xmlns:wpi="http://schemas.microsoft.com/office/word/2010/wordprocessingInk" xmlns:wne="http://schemas.microsoft.com/office/word/2006/wordml" xmlns:wps="http://schemas.microsoft.com/office/word/2010/wordprocessingShape" xmlns:wpsCustomData="http://www.wps.cn/officeDocument/2013/wpsCustomData" mc:Ignorable="w14 w15 wp14">
+  <w:p/>
+</w:ftr>
+</file>
+
+<file path=word/footer3.xml><?xml version="1.0" encoding="utf-8"?>
+<w:ftr xmlns:wpc="http://schemas.microsoft.com/office/word/2010/wordprocessingCanvas" xmlns:mc="http://schemas.openxmlformats.org/markup-compatibility/2006" xmlns:o="urn:schemas-microsoft-com:office:office" xmlns:r="http://schemas.openxmlformats.org/officeDocument/2006/relationships" xmlns:m="http://schemas.openxmlformats.org/officeDocument/2006/math" xmlns:v="urn:schemas-microsoft-com:vml" xmlns:wp14="http://schemas.microsoft.com/office/word/2010/wordprocessingDrawing" xmlns:wp="http://schemas.openxmlformats.org/drawingml/2006/wordprocessingDrawing" xmlns:w10="urn:schemas-microsoft-com:office:word" xmlns:w="http://schemas.openxmlformats.org/wordprocessingml/2006/main" xmlns:w14="http://schemas.microsoft.com/office/word/2010/wordml" xmlns:w15="http://schemas.microsoft.com/office/word/2012/wordml" xmlns:wpg="http://schemas.microsoft.com/office/word/2010/wordprocessingGroup" xmlns:wpi="http://schemas.microsoft.com/office/word/2010/wordprocessingInk" xmlns:wne="http://schemas.microsoft.com/office/word/2006/wordml" xmlns:wps="http://schemas.microsoft.com/office/word/2010/wordprocessingShape" xmlns:wpsCustomData="http://www.wps.cn/officeDocument/2013/wpsCustomData" mc:Ignorable="w14 w15 wp14">
+  <w:p/>
+</w:ftr>
+</file>
+
 <file path=word/footnotes.xml><?xml version="1.0" encoding="utf-8"?>
 <w:footnotes xmlns:wpc="http://schemas.microsoft.com/office/word/2010/wordprocessingCanvas" xmlns:mc="http://schemas.openxmlformats.org/markup-compatibility/2006" xmlns:o="urn:schemas-microsoft-com:office:office" xmlns:r="http://schemas.openxmlformats.org/officeDocument/2006/relationships" xmlns:m="http://schemas.openxmlformats.org/officeDocument/2006/math" xmlns:v="urn:schemas-microsoft-com:vml" xmlns:wp14="http://schemas.microsoft.com/office/word/2010/wordprocessingDrawing" xmlns:wp="http://schemas.openxmlformats.org/drawingml/2006/wordprocessingDrawing" xmlns:w="http://schemas.openxmlformats.org/wordprocessingml/2006/main" xmlns:w14="http://schemas.microsoft.com/office/word/2010/wordml" xmlns:w15="http://schemas.microsoft.com/office/word/2012/wordml" xmlns:w10="urn:schemas-microsoft-com:office:word" xmlns:wpg="http://schemas.microsoft.com/office/word/2010/wordprocessingGroup" xmlns:wpi="http://schemas.microsoft.com/office/word/2010/wordprocessingInk" xmlns:wne="http://schemas.microsoft.com/office/word/2006/wordml" xmlns:wps="http://schemas.microsoft.com/office/word/2010/wordprocessingShape" xmlns:wpsCustomData="http://www.wps.cn/officeDocument/2013/wpsCustomData" mc:Ignorable="w14 w15 wp14">
   <w:footnote w:type="separator" w:id="0">
@@ -25520,6 +25658,24 @@
     </w:p>
   </w:footnote>
 </w:footnotes>
+</file>
+
+<file path=word/header1.xml><?xml version="1.0" encoding="utf-8"?>
+<w:hdr xmlns:wpc="http://schemas.microsoft.com/office/word/2010/wordprocessingCanvas" xmlns:mc="http://schemas.openxmlformats.org/markup-compatibility/2006" xmlns:o="urn:schemas-microsoft-com:office:office" xmlns:r="http://schemas.openxmlformats.org/officeDocument/2006/relationships" xmlns:m="http://schemas.openxmlformats.org/officeDocument/2006/math" xmlns:v="urn:schemas-microsoft-com:vml" xmlns:wp14="http://schemas.microsoft.com/office/word/2010/wordprocessingDrawing" xmlns:wp="http://schemas.openxmlformats.org/drawingml/2006/wordprocessingDrawing" xmlns:w10="urn:schemas-microsoft-com:office:word" xmlns:w="http://schemas.openxmlformats.org/wordprocessingml/2006/main" xmlns:w14="http://schemas.microsoft.com/office/word/2010/wordml" xmlns:w15="http://schemas.microsoft.com/office/word/2012/wordml" xmlns:wpg="http://schemas.microsoft.com/office/word/2010/wordprocessingGroup" xmlns:wpi="http://schemas.microsoft.com/office/word/2010/wordprocessingInk" xmlns:wne="http://schemas.microsoft.com/office/word/2006/wordml" xmlns:wps="http://schemas.microsoft.com/office/word/2010/wordprocessingShape" xmlns:wpsCustomData="http://www.wps.cn/officeDocument/2013/wpsCustomData" mc:Ignorable="w14 w15 wp14">
+  <w:p/>
+</w:hdr>
+</file>
+
+<file path=word/header2.xml><?xml version="1.0" encoding="utf-8"?>
+<w:hdr xmlns:wpc="http://schemas.microsoft.com/office/word/2010/wordprocessingCanvas" xmlns:mc="http://schemas.openxmlformats.org/markup-compatibility/2006" xmlns:o="urn:schemas-microsoft-com:office:office" xmlns:r="http://schemas.openxmlformats.org/officeDocument/2006/relationships" xmlns:m="http://schemas.openxmlformats.org/officeDocument/2006/math" xmlns:v="urn:schemas-microsoft-com:vml" xmlns:wp14="http://schemas.microsoft.com/office/word/2010/wordprocessingDrawing" xmlns:wp="http://schemas.openxmlformats.org/drawingml/2006/wordprocessingDrawing" xmlns:w10="urn:schemas-microsoft-com:office:word" xmlns:w="http://schemas.openxmlformats.org/wordprocessingml/2006/main" xmlns:w14="http://schemas.microsoft.com/office/word/2010/wordml" xmlns:w15="http://schemas.microsoft.com/office/word/2012/wordml" xmlns:wpg="http://schemas.microsoft.com/office/word/2010/wordprocessingGroup" xmlns:wpi="http://schemas.microsoft.com/office/word/2010/wordprocessingInk" xmlns:wne="http://schemas.microsoft.com/office/word/2006/wordml" xmlns:wps="http://schemas.microsoft.com/office/word/2010/wordprocessingShape" xmlns:wpsCustomData="http://www.wps.cn/officeDocument/2013/wpsCustomData" mc:Ignorable="w14 w15 wp14">
+  <w:p/>
+</w:hdr>
+</file>
+
+<file path=word/header3.xml><?xml version="1.0" encoding="utf-8"?>
+<w:hdr xmlns:wpc="http://schemas.microsoft.com/office/word/2010/wordprocessingCanvas" xmlns:mc="http://schemas.openxmlformats.org/markup-compatibility/2006" xmlns:o="urn:schemas-microsoft-com:office:office" xmlns:r="http://schemas.openxmlformats.org/officeDocument/2006/relationships" xmlns:m="http://schemas.openxmlformats.org/officeDocument/2006/math" xmlns:v="urn:schemas-microsoft-com:vml" xmlns:wp14="http://schemas.microsoft.com/office/word/2010/wordprocessingDrawing" xmlns:wp="http://schemas.openxmlformats.org/drawingml/2006/wordprocessingDrawing" xmlns:w10="urn:schemas-microsoft-com:office:word" xmlns:w="http://schemas.openxmlformats.org/wordprocessingml/2006/main" xmlns:w14="http://schemas.microsoft.com/office/word/2010/wordml" xmlns:w15="http://schemas.microsoft.com/office/word/2012/wordml" xmlns:wpg="http://schemas.microsoft.com/office/word/2010/wordprocessingGroup" xmlns:wpi="http://schemas.microsoft.com/office/word/2010/wordprocessingInk" xmlns:wne="http://schemas.microsoft.com/office/word/2006/wordml" xmlns:wps="http://schemas.microsoft.com/office/word/2010/wordprocessingShape" xmlns:wpsCustomData="http://www.wps.cn/officeDocument/2013/wpsCustomData" mc:Ignorable="w14 w15 wp14">
+  <w:p/>
+</w:hdr>
 </file>
 
 <file path=word/numbering.xml><?xml version="1.0" encoding="utf-8"?>
@@ -38804,7 +38960,7 @@
 </file>
 
 <file path=customXml/item1.xml><?xml version="1.0" encoding="utf-8"?>
-<b:Sources xmlns="http://schemas.openxmlformats.org/officeDocument/2006/bibliography" xmlns:b="http://schemas.openxmlformats.org/officeDocument/2006/bibliography" SelectedStyle="/APA.XSL" StyleName="APA"/>
+<b:Sources xmlns="http://schemas.openxmlformats.org/officeDocument/2006/bibliography" xmlns:b="http://schemas.openxmlformats.org/officeDocument/2006/bibliography" StyleName="APA" SelectedStyle="/APA.XSL"/>
 </file>
 
 <file path=customXml/itemProps1.xml><?xml version="1.0" encoding="utf-8"?>

</xml_diff>